<commit_message>
Dissertation: CyBOK section, figure/table sources, spec alignment; docs layout; supervisor package; scripts
- Add Chapter 2 CyBOK mapping (2.9) and renumber chapter summary (2.10)
- Add Source lines for results figures and metric tables; Table 5 literature source
- Interim feedback (3.5), spec/ethics cross-references in scope and ethics sections
- scripts/compare_spec_to_dissertation.py and SPEC_DISSERTATION_ALIGNMENT.md
- dissertation_to_docx: Heading 4 Arial, multi-path project spec resolution
- Reorganise docs under docs/planning, docs/reports, docs/reference, docs/viva
- Add B01821011 final report package and main report assets; sensitivity/ablation figures
- Remove temporary _handbook_extract; ignore future extracts in .gitignore

Made-with: Cursor
</commit_message>
<xml_diff>
--- a/archive/interim_report/B01821011_Interim_Report_Final_v2.docx
+++ b/archive/interim_report/B01821011_Interim_Report_Final_v2.docx
@@ -205,23 +205,7 @@
       </w:r>
       <w:r>
         <w:br/>
-        <w:t xml:space="preserve">Explainable Dynamic Graph Neural Network </w:t>
-      </w:r>
-      <w:proofErr w:type="spellStart"/>
-      <w:r>
-        <w:t>SIEM</w:t>
-      </w:r>
-      <w:proofErr w:type="spellEnd"/>
-      <w:r>
-        <w:t xml:space="preserve"> for Software-Defined </w:t>
-      </w:r>
-      <w:proofErr w:type="spellStart"/>
-      <w:r>
-        <w:t>IoT</w:t>
-      </w:r>
-      <w:proofErr w:type="spellEnd"/>
-      <w:r>
-        <w:t xml:space="preserve"> using Edge AI and Federated Learning  </w:t>
+        <w:t xml:space="preserve">Explainable Dynamic Graph Neural Network SIEM for Software-Defined IoT using Edge AI and Federated Learning  </w:t>
       </w:r>
       <w:r>
         <w:br/>
@@ -294,16 +278,8 @@
         <w:rPr>
           <w:b/>
         </w:rPr>
-        <w:t xml:space="preserve">Supervisor: Dr. Raja </w:t>
-      </w:r>
-      <w:proofErr w:type="spellStart"/>
-      <w:r>
-        <w:rPr>
-          <w:b/>
-        </w:rPr>
-        <w:t>Ujjan</w:t>
-      </w:r>
-      <w:proofErr w:type="spellEnd"/>
+        <w:t>Supervisor: Dr. Raja Ujjan</w:t>
+      </w:r>
     </w:p>
     <w:p>
       <w:pPr>
@@ -317,30 +293,8 @@
         <w:rPr>
           <w:b/>
         </w:rPr>
-        <w:t xml:space="preserve">Moderator: </w:t>
-      </w:r>
-      <w:proofErr w:type="spellStart"/>
-      <w:r>
-        <w:rPr>
-          <w:b/>
-        </w:rPr>
-        <w:t>Muhsin</w:t>
-      </w:r>
-      <w:proofErr w:type="spellEnd"/>
-      <w:r>
-        <w:rPr>
-          <w:b/>
-        </w:rPr>
-        <w:t xml:space="preserve"> </w:t>
-      </w:r>
-      <w:proofErr w:type="spellStart"/>
-      <w:r>
-        <w:rPr>
-          <w:b/>
-        </w:rPr>
-        <w:t>Hassanu</w:t>
-      </w:r>
-      <w:proofErr w:type="spellEnd"/>
+        <w:t>Moderator: Muhsin Hassanu</w:t>
+      </w:r>
     </w:p>
     <w:p>
       <w:pPr>
@@ -371,13 +325,7 @@
         <w:rPr>
           <w:rFonts w:ascii="Times New Roman" w:hAnsi="Times New Roman" w:cs="Times New Roman"/>
         </w:rPr>
-        <w:t xml:space="preserve">I confirm that this interim report is my own work and does not include any work that has been completed </w:t>
-      </w:r>
-      <w:r>
-        <w:rPr>
-          <w:rFonts w:ascii="Times New Roman" w:hAnsi="Times New Roman" w:cs="Times New Roman"/>
-        </w:rPr>
-        <w:t>by anyone else. Where I have used the work of others, I have clearly identified and referenced it. I understand that the University may check my work for plagiarism using Turnitin or similar tools.</w:t>
+        <w:t>I confirm that this interim report is my own work and does not include any work that has been completed by anyone else. Where I have used the work of others, I have clearly identified and referenced it. I understand that the University may check my work for plagiarism using Turnitin or similar tools.</w:t>
       </w:r>
     </w:p>
     <w:p>
@@ -509,6 +457,14 @@
     </w:p>
     <w:sdt>
       <w:sdtPr>
+        <w:rPr>
+          <w:rFonts w:ascii="Calibri" w:eastAsiaTheme="minorEastAsia" w:hAnsi="Calibri" w:cstheme="minorBidi"/>
+          <w:b w:val="0"/>
+          <w:bCs w:val="0"/>
+          <w:color w:val="auto"/>
+          <w:sz w:val="22"/>
+          <w:szCs w:val="22"/>
+        </w:rPr>
         <w:id w:val="175783149"/>
         <w:docPartObj>
           <w:docPartGallery w:val="Table of Contents"/>
@@ -517,11 +473,7 @@
       </w:sdtPr>
       <w:sdtEndPr>
         <w:rPr>
-          <w:rFonts w:ascii="Calibri" w:eastAsiaTheme="minorEastAsia" w:hAnsi="Calibri" w:cstheme="minorBidi"/>
           <w:noProof/>
-          <w:color w:val="auto"/>
-          <w:sz w:val="22"/>
-          <w:szCs w:val="22"/>
         </w:rPr>
       </w:sdtEndPr>
       <w:sdtContent>
@@ -2505,21 +2457,7 @@
         <w:rPr>
           <w:rFonts w:ascii="Times New Roman" w:hAnsi="Times New Roman" w:cs="Times New Roman"/>
         </w:rPr>
-        <w:t xml:space="preserve"> Taxonomy of IDS approaches relevant to </w:t>
-      </w:r>
-      <w:proofErr w:type="spellStart"/>
-      <w:r>
-        <w:rPr>
-          <w:rFonts w:ascii="Times New Roman" w:hAnsi="Times New Roman" w:cs="Times New Roman"/>
-        </w:rPr>
-        <w:t>IoT</w:t>
-      </w:r>
-      <w:proofErr w:type="spellEnd"/>
-      <w:r>
-        <w:rPr>
-          <w:rFonts w:ascii="Times New Roman" w:hAnsi="Times New Roman" w:cs="Times New Roman"/>
-        </w:rPr>
-        <w:t xml:space="preserve"> and this project</w:t>
+        <w:t xml:space="preserve"> Taxonomy of IDS approaches relevant to IoT and this project</w:t>
       </w:r>
     </w:p>
     <w:p>
@@ -2581,21 +2519,7 @@
         <w:rPr>
           <w:rFonts w:ascii="Times New Roman" w:hAnsi="Times New Roman" w:cs="Times New Roman"/>
         </w:rPr>
-        <w:t xml:space="preserve"> Federated learning (</w:t>
-      </w:r>
-      <w:proofErr w:type="spellStart"/>
-      <w:r>
-        <w:rPr>
-          <w:rFonts w:ascii="Times New Roman" w:hAnsi="Times New Roman" w:cs="Times New Roman"/>
-        </w:rPr>
-        <w:t>FedAvg</w:t>
-      </w:r>
-      <w:proofErr w:type="spellEnd"/>
-      <w:r>
-        <w:rPr>
-          <w:rFonts w:ascii="Times New Roman" w:hAnsi="Times New Roman" w:cs="Times New Roman"/>
-        </w:rPr>
-        <w:t>) flow</w:t>
+        <w:t xml:space="preserve"> Federated learning (FedAvg) flow</w:t>
       </w:r>
     </w:p>
     <w:p>
@@ -2626,21 +2550,7 @@
         <w:rPr>
           <w:rFonts w:ascii="Times New Roman" w:hAnsi="Times New Roman" w:cs="Times New Roman"/>
         </w:rPr>
-        <w:t xml:space="preserve"> Explainability pipeline for </w:t>
-      </w:r>
-      <w:proofErr w:type="spellStart"/>
-      <w:r>
-        <w:rPr>
-          <w:rFonts w:ascii="Times New Roman" w:hAnsi="Times New Roman" w:cs="Times New Roman"/>
-        </w:rPr>
-        <w:t>SOC</w:t>
-      </w:r>
-      <w:proofErr w:type="spellEnd"/>
-      <w:r>
-        <w:rPr>
-          <w:rFonts w:ascii="Times New Roman" w:hAnsi="Times New Roman" w:cs="Times New Roman"/>
-        </w:rPr>
-        <w:t xml:space="preserve"> alerts</w:t>
+        <w:t xml:space="preserve"> Explainability pipeline for SOC alerts</w:t>
       </w:r>
     </w:p>
     <w:p>
@@ -2671,35 +2581,7 @@
         <w:rPr>
           <w:rFonts w:ascii="Times New Roman" w:hAnsi="Times New Roman" w:cs="Times New Roman"/>
         </w:rPr>
-        <w:t xml:space="preserve"> Positioning of related work (GNN, FL, </w:t>
-      </w:r>
-      <w:proofErr w:type="spellStart"/>
-      <w:r>
-        <w:rPr>
-          <w:rFonts w:ascii="Times New Roman" w:hAnsi="Times New Roman" w:cs="Times New Roman"/>
-        </w:rPr>
-        <w:t>explainability</w:t>
-      </w:r>
-      <w:proofErr w:type="spellEnd"/>
-      <w:r>
-        <w:rPr>
-          <w:rFonts w:ascii="Times New Roman" w:hAnsi="Times New Roman" w:cs="Times New Roman"/>
-        </w:rPr>
-        <w:t xml:space="preserve">, </w:t>
-      </w:r>
-      <w:proofErr w:type="spellStart"/>
-      <w:r>
-        <w:rPr>
-          <w:rFonts w:ascii="Times New Roman" w:hAnsi="Times New Roman" w:cs="Times New Roman"/>
-        </w:rPr>
-        <w:t>SIEM</w:t>
-      </w:r>
-      <w:proofErr w:type="spellEnd"/>
-      <w:r>
-        <w:rPr>
-          <w:rFonts w:ascii="Times New Roman" w:hAnsi="Times New Roman" w:cs="Times New Roman"/>
-        </w:rPr>
-        <w:t>)</w:t>
+        <w:t xml:space="preserve"> Positioning of related work (GNN, FL, explainability, SIEM)</w:t>
       </w:r>
     </w:p>
     <w:p>
@@ -2983,13 +2865,7 @@
         <w:rPr>
           <w:rFonts w:ascii="Times New Roman" w:hAnsi="Times New Roman" w:cs="Times New Roman"/>
         </w:rPr>
-        <w:t>I am submitting this interim report halfway through my MSc project. The aim is to give my supervisor and moderator enough detail to check my progress and offer advice. This is not a first draft of th</w:t>
-      </w:r>
-      <w:r>
-        <w:rPr>
-          <w:rFonts w:ascii="Times New Roman" w:hAnsi="Times New Roman" w:cs="Times New Roman"/>
-        </w:rPr>
-        <w:t>e final report. It has three parts: (1) a summary literature review, (2) a description of my research methodology, and (3) a plan for completion.</w:t>
+        <w:t>I am submitting this interim report halfway through my MSc project. The aim is to give my supervisor and moderator enough detail to check my progress and offer advice. This is not a first draft of the final report. It has three parts: (1) a summary literature review, (2) a description of my research methodology, and (3) a plan for completion.</w:t>
       </w:r>
     </w:p>
     <w:p>
@@ -3003,19 +2879,7 @@
         <w:rPr>
           <w:rFonts w:ascii="Times New Roman" w:hAnsi="Times New Roman" w:cs="Times New Roman"/>
         </w:rPr>
-        <w:t xml:space="preserve">My project aims to design and build a prototype system that can detect attacks in IoT network traffic. The </w:t>
-      </w:r>
-      <w:r>
-        <w:rPr>
-          <w:rFonts w:ascii="Times New Roman" w:hAnsi="Times New Roman" w:cs="Times New Roman"/>
-        </w:rPr>
-        <w:t>system uses a dynamic graph neural network (GNN) with a Graph Attention Network (GAT) and a Gated Recurrent Unit (GRU). It is trained with federated learning so that raw data does not need to leave client sites. It also produces explainable alerts in a for</w:t>
-      </w:r>
-      <w:r>
-        <w:rPr>
-          <w:rFonts w:ascii="Times New Roman" w:hAnsi="Times New Roman" w:cs="Times New Roman"/>
-        </w:rPr>
-        <w:t>mat that Security Operations Centre (SOC) analysts can use with their SIEM tools. The main research question is:</w:t>
+        <w:t>My project aims to design and build a prototype system that can detect attacks in IoT network traffic. The system uses a dynamic graph neural network (GNN) with a Graph Attention Network (GAT) and a Gated Recurrent Unit (GRU). It is trained with federated learning so that raw data does not need to leave client sites. It also produces explainable alerts in a format that Security Operations Centre (SOC) analysts can use with their SIEM tools. The main research question is:</w:t>
       </w:r>
     </w:p>
     <w:p>
@@ -3030,14 +2894,7 @@
           <w:rFonts w:ascii="Times New Roman" w:hAnsi="Times New Roman" w:cs="Times New Roman"/>
           <w:i/>
         </w:rPr>
-        <w:t>How can an explainable dynamic graph neural network, trained using federated learning, detect attacks in Software-Defined IoT flow data and gen</w:t>
-      </w:r>
-      <w:r>
-        <w:rPr>
-          <w:rFonts w:ascii="Times New Roman" w:hAnsi="Times New Roman" w:cs="Times New Roman"/>
-          <w:i/>
-        </w:rPr>
-        <w:t>erate SIEM alerts that support SOC operations on CPU-based edge devices?</w:t>
+        <w:t>How can an explainable dynamic graph neural network, trained using federated learning, detect attacks in Software-Defined IoT flow data and generate SIEM alerts that support SOC operations on CPU-based edge devices?</w:t>
       </w:r>
     </w:p>
     <w:p>
@@ -3051,13 +2908,7 @@
         <w:rPr>
           <w:rFonts w:ascii="Times New Roman" w:hAnsi="Times New Roman" w:cs="Times New Roman"/>
         </w:rPr>
-        <w:t>At this point in the project, I have completed the data pipeline, built all four models (Random Forest, MLP, centralised GNN, and federated GNN), and set up the explainability and SIE</w:t>
-      </w:r>
-      <w:r>
-        <w:rPr>
-          <w:rFonts w:ascii="Times New Roman" w:hAnsi="Times New Roman" w:cs="Times New Roman"/>
-        </w:rPr>
-        <w:t>M alert components. I have collected preliminary metrics but I have not yet done the final evaluation. The final results will be gathered, analysed and presented in the final dissertation report.</w:t>
+        <w:t>At this point in the project, I have completed the data pipeline, built all four models (Random Forest, MLP, centralised GNN, and federated GNN), and set up the explainability and SIEM alert components. I have collected preliminary metrics but I have not yet done the final evaluation. The final results will be gathered, analysed and presented in the final dissertation report.</w:t>
       </w:r>
     </w:p>
     <w:p>
@@ -3088,13 +2939,7 @@
         <w:rPr>
           <w:rFonts w:ascii="Times New Roman" w:hAnsi="Times New Roman" w:cs="Times New Roman"/>
         </w:rPr>
-        <w:t>Below, I summarise the key academic work in my subject area and explain how it shaped my resea</w:t>
-      </w:r>
-      <w:r>
-        <w:rPr>
-          <w:rFonts w:ascii="Times New Roman" w:hAnsi="Times New Roman" w:cs="Times New Roman"/>
-        </w:rPr>
-        <w:t>rch. I look at what earlier studies did well, where they fell short, and what gap my project tries to fill. Figure 1 shows the main categories of intrusion detection relevant to IoT.</w:t>
+        <w:t>Below, I summarise the key academic work in my subject area and explain how it shaped my research. I look at what earlier studies did well, where they fell short, and what gap my project tries to fill. Figure 1 shows the main categories of intrusion detection relevant to IoT.</w:t>
       </w:r>
     </w:p>
     <w:p>
@@ -3207,25 +3052,7 @@
         <w:rPr>
           <w:rFonts w:ascii="Times New Roman" w:hAnsi="Times New Roman" w:cs="Times New Roman"/>
         </w:rPr>
-        <w:t xml:space="preserve">The number of IoT devices has gone up a lot in recent years, and this growth has brought serious security </w:t>
-      </w:r>
-      <w:r>
-        <w:rPr>
-          <w:rFonts w:ascii="Times New Roman" w:hAnsi="Times New Roman" w:cs="Times New Roman"/>
-        </w:rPr>
-        <w:t>problems in consumer, industrial and critical infrastructure (Kolias et al., 2017). Many IoT devices use default passwords and have weak security. They also get few firmware updates. This makes them easy targets for attackers. When hacked, these devices ca</w:t>
-      </w:r>
-      <w:r>
-        <w:rPr>
-          <w:rFonts w:ascii="Times New Roman" w:hAnsi="Times New Roman" w:cs="Times New Roman"/>
-        </w:rPr>
-        <w:t>n join large botnets like Mirai, which launched DDoS attacks over 1 Tbps (Antonakakis et al., 2017). I chose to focus on IoT security because these kinds of attacks are becoming more frequent and harder to stop with old methods. The variety and number of I</w:t>
-      </w:r>
-      <w:r>
-        <w:rPr>
-          <w:rFonts w:ascii="Times New Roman" w:hAnsi="Times New Roman" w:cs="Times New Roman"/>
-        </w:rPr>
-        <w:t>oT devices make defence hard, and old security models cannot monitor thousands of different devices easily.</w:t>
+        <w:t>The number of IoT devices has gone up a lot in recent years, and this growth has brought serious security problems in consumer, industrial and critical infrastructure (Kolias et al., 2017). Many IoT devices use default passwords and have weak security. They also get few firmware updates. This makes them easy targets for attackers. When hacked, these devices can join large botnets like Mirai, which launched DDoS attacks over 1 Tbps (Antonakakis et al., 2017). I chose to focus on IoT security because these kinds of attacks are becoming more frequent and harder to stop with old methods. The variety and number of IoT devices make defence hard, and old security models cannot monitor thousands of different devices easily.</w:t>
       </w:r>
     </w:p>
     <w:p>
@@ -3239,25 +3066,7 @@
         <w:rPr>
           <w:rFonts w:ascii="Times New Roman" w:hAnsi="Times New Roman" w:cs="Times New Roman"/>
         </w:rPr>
-        <w:t>Software-Defined IoT (SDIoT) helps with this problem. It separates the control plane from the data plane. This allows centralised network management</w:t>
-      </w:r>
-      <w:r>
-        <w:rPr>
-          <w:rFonts w:ascii="Times New Roman" w:hAnsi="Times New Roman" w:cs="Times New Roman"/>
-        </w:rPr>
-        <w:t xml:space="preserve"> through SDN controllers (Bera, Misra and Vasilakos, 2017). In SDIoT, the controller can see all forwarding decisions. It can also export flow data such as packet counts, byte counts and protocol breakdowns. This makes SDIoT a good fit for machine learning</w:t>
-      </w:r>
-      <w:r>
-        <w:rPr>
-          <w:rFonts w:ascii="Times New Roman" w:hAnsi="Times New Roman" w:cs="Times New Roman"/>
-        </w:rPr>
-        <w:t xml:space="preserve"> intrusion detection because the controller collects data from the whole network without needing software on each device. My project uses flow-level features from the CICIoT2023 dataset (Pinto Neto et al., 2023). These features are similar to what an SDN c</w:t>
-      </w:r>
-      <w:r>
-        <w:rPr>
-          <w:rFonts w:ascii="Times New Roman" w:hAnsi="Times New Roman" w:cs="Times New Roman"/>
-        </w:rPr>
-        <w:t>ontroller would produce.</w:t>
+        <w:t>Software-Defined IoT (SDIoT) helps with this problem. It separates the control plane from the data plane. This allows centralised network management through SDN controllers (Bera, Misra and Vasilakos, 2017). In SDIoT, the controller can see all forwarding decisions. It can also export flow data such as packet counts, byte counts and protocol breakdowns. This makes SDIoT a good fit for machine learning intrusion detection because the controller collects data from the whole network without needing software on each device. My project uses flow-level features from the CICIoT2023 dataset (Pinto Neto et al., 2023). These features are similar to what an SDN controller would produce.</w:t>
       </w:r>
     </w:p>
     <w:p>
@@ -3272,19 +3081,7 @@
           <w:rFonts w:ascii="Times New Roman" w:hAnsi="Times New Roman" w:cs="Times New Roman"/>
         </w:rPr>
         <w:lastRenderedPageBreak/>
-        <w:t xml:space="preserve">However, Bera, Misra and Vasilakos (2017) mainly looked at SDN architecture. They did not show ML-based detection in that setup. Yang et al. (2025) recently showed that GNNs can improve intrusion detection for industrial IoT by </w:t>
-      </w:r>
-      <w:r>
-        <w:rPr>
-          <w:rFonts w:ascii="Times New Roman" w:hAnsi="Times New Roman" w:cs="Times New Roman"/>
-        </w:rPr>
-        <w:t>modelling network structure, but they did not combine this with federated learning or SIEM output. So there is still a gap between the SDIoT idea and real intrusion detection systems that use graphs, federated learning and explainability together. My proje</w:t>
-      </w:r>
-      <w:r>
-        <w:rPr>
-          <w:rFonts w:ascii="Times New Roman" w:hAnsi="Times New Roman" w:cs="Times New Roman"/>
-        </w:rPr>
-        <w:t>ct fills this gap.</w:t>
+        <w:t>However, Bera, Misra and Vasilakos (2017) mainly looked at SDN architecture. They did not show ML-based detection in that setup. Yang et al. (2025) recently showed that GNNs can improve intrusion detection for industrial IoT by modelling network structure, but they did not combine this with federated learning or SIEM output. So there is still a gap between the SDIoT idea and real intrusion detection systems that use graphs, federated learning and explainability together. My project fills this gap.</w:t>
       </w:r>
     </w:p>
     <w:p>
@@ -3315,19 +3112,7 @@
         <w:rPr>
           <w:rFonts w:ascii="Times New Roman" w:hAnsi="Times New Roman" w:cs="Times New Roman"/>
         </w:rPr>
-        <w:t>These days, machine learning is one of the most common ways to detect intrusions in network traffic. Models are trained on flow features to classify traffic as benign or malicious. Ran</w:t>
-      </w:r>
-      <w:r>
-        <w:rPr>
-          <w:rFonts w:ascii="Times New Roman" w:hAnsi="Times New Roman" w:cs="Times New Roman"/>
-        </w:rPr>
-        <w:t>dom Forest works well on network datasets. It does not overfit easily and it selects features through ensemble averaging (Ahmad et al., 2021). On CICIoT2023, Pinto Neto et al. (2023) found Random Forest got over 99% accuracy for binary detection. Because o</w:t>
-      </w:r>
-      <w:r>
-        <w:rPr>
-          <w:rFonts w:ascii="Times New Roman" w:hAnsi="Times New Roman" w:cs="Times New Roman"/>
-        </w:rPr>
-        <w:t>f this strong track record, I decided to use Random Forest as one of my baseline models.</w:t>
+        <w:t>These days, machine learning is one of the most common ways to detect intrusions in network traffic. Models are trained on flow features to classify traffic as benign or malicious. Random Forest works well on network datasets. It does not overfit easily and it selects features through ensemble averaging (Ahmad et al., 2021). On CICIoT2023, Pinto Neto et al. (2023) found Random Forest got over 99% accuracy for binary detection. Because of this strong track record, I decided to use Random Forest as one of my baseline models.</w:t>
       </w:r>
     </w:p>
     <w:p>
@@ -3341,31 +3126,7 @@
         <w:rPr>
           <w:rFonts w:ascii="Times New Roman" w:hAnsi="Times New Roman" w:cs="Times New Roman"/>
         </w:rPr>
-        <w:t>Deep learning approaches such as MLPs can learn complex patterns without manual feature engineering (Shone et al., 2018). Shone et al. (2018) used deep autoencoders wi</w:t>
-      </w:r>
-      <w:r>
-        <w:rPr>
-          <w:rFonts w:ascii="Times New Roman" w:hAnsi="Times New Roman" w:cs="Times New Roman"/>
-        </w:rPr>
-        <w:t>th classifiers on NSL-KDD and got good results. However, NSL-KDD is smaller and less diverse than CICIoT2023. They also did not consider temporal relationships or links between flows. Both Random Forest and MLP treat each flow independently. They ignore co</w:t>
-      </w:r>
-      <w:r>
-        <w:rPr>
-          <w:rFonts w:ascii="Times New Roman" w:hAnsi="Times New Roman" w:cs="Times New Roman"/>
-        </w:rPr>
-        <w:t xml:space="preserve">nnections between flows. This is a limitation because, in real networks, flows are linked. For example, a scan often comes before an attack. Command-and-control traffic connects to data theft. If we ignore these links, we miss multi-stage attacks (Caville </w:t>
-      </w:r>
-      <w:r>
-        <w:rPr>
-          <w:rFonts w:ascii="Times New Roman" w:hAnsi="Times New Roman" w:cs="Times New Roman"/>
-        </w:rPr>
-        <w:t>et al., 2022). Wang et al. (2025) did a scoping review and found that graph-based approaches to network traffic analysis are used more and more. Zhong et al. (2024) surveyed GNNs for intrusion detection and noted that explainability and federated deploymen</w:t>
-      </w:r>
-      <w:r>
-        <w:rPr>
-          <w:rFonts w:ascii="Times New Roman" w:hAnsi="Times New Roman" w:cs="Times New Roman"/>
-        </w:rPr>
-        <w:t>t are still under-explored. These findings support the graph-based approach in this project.</w:t>
+        <w:t>Deep learning approaches such as MLPs can learn complex patterns without manual feature engineering (Shone et al., 2018). Shone et al. (2018) used deep autoencoders with classifiers on NSL-KDD and got good results. However, NSL-KDD is smaller and less diverse than CICIoT2023. They also did not consider temporal relationships or links between flows. Both Random Forest and MLP treat each flow independently. They ignore connections between flows. This is a limitation because, in real networks, flows are linked. For example, a scan often comes before an attack. Command-and-control traffic connects to data theft. If we ignore these links, we miss multi-stage attacks (Caville et al., 2022). Wang et al. (2025) did a scoping review and found that graph-based approaches to network traffic analysis are used more and more. Zhong et al. (2024) surveyed GNNs for intrusion detection and noted that explainability and federated deployment are still under-explored. These findings support the graph-based approach in this project.</w:t>
       </w:r>
     </w:p>
     <w:p>
@@ -3396,19 +3157,7 @@
         <w:rPr>
           <w:rFonts w:ascii="Times New Roman" w:hAnsi="Times New Roman" w:cs="Times New Roman"/>
         </w:rPr>
-        <w:t>GNNs are a type of neural network that can work with data arranged as a graph, where nodes and edges show how things c</w:t>
-      </w:r>
-      <w:r>
-        <w:rPr>
-          <w:rFonts w:ascii="Times New Roman" w:hAnsi="Times New Roman" w:cs="Times New Roman"/>
-        </w:rPr>
-        <w:t>onnect. Nodes can represent flows or hosts, and edges show communication links. The GNN learns from its neighbours through message passing (Caville et al., 2022). Graph Attention Networks (GATs) go further. They learn to give different weights to different</w:t>
-      </w:r>
-      <w:r>
-        <w:rPr>
-          <w:rFonts w:ascii="Times New Roman" w:hAnsi="Times New Roman" w:cs="Times New Roman"/>
-        </w:rPr>
-        <w:t xml:space="preserve"> neighbours, so the model focuses on the most important connections (Velickovic et al., </w:t>
+        <w:t xml:space="preserve">GNNs are a type of neural network that can work with data arranged as a graph, where nodes and edges show how things connect. Nodes can represent flows or hosts, and edges show communication links. The GNN learns from its neighbours through message passing (Caville et al., 2022). Graph Attention Networks (GATs) go further. They learn to give different weights to different neighbours, so the model focuses on the most important connections (Velickovic et al., </w:t>
       </w:r>
       <w:r>
         <w:rPr>
@@ -3429,31 +3178,7 @@
         <w:rPr>
           <w:rFonts w:ascii="Times New Roman" w:hAnsi="Times New Roman" w:cs="Times New Roman"/>
         </w:rPr>
-        <w:t>Basak et al. (2025) used GNNs for intrusion detection on UN</w:t>
-      </w:r>
-      <w:r>
-        <w:rPr>
-          <w:rFonts w:ascii="Times New Roman" w:hAnsi="Times New Roman" w:cs="Times New Roman"/>
-        </w:rPr>
-        <w:t>SW-NB15. They built graphs from flow features with edges linking similar flows. They got F1 over 97%. However, a key limitation is that they used static graphs. The whole dataset was one snapshot. They did not capture how behaviour changes over time. Also,</w:t>
-      </w:r>
-      <w:r>
-        <w:rPr>
-          <w:rFonts w:ascii="Times New Roman" w:hAnsi="Times New Roman" w:cs="Times New Roman"/>
-        </w:rPr>
-        <w:t xml:space="preserve"> UNSW-NB15 is older and has fewer attack types than CICIoT2023. Han et al. (2025) proposed DIMK-GCN for intrusion detection and showed that multi-scale graph representations can capture both local and global attack patterns. Ngo et al. (2025) used GNNs on </w:t>
-      </w:r>
-      <w:r>
-        <w:rPr>
-          <w:rFonts w:ascii="Times New Roman" w:hAnsi="Times New Roman" w:cs="Times New Roman"/>
-        </w:rPr>
-        <w:t>IoT datasets with kNN-based graph construction. Edges linked flows that were similar in feature space. This worked without needing device topology. They found k=5 is a good default. However, they also used static graphs with no temporal modelling. This gap</w:t>
-      </w:r>
-      <w:r>
-        <w:rPr>
-          <w:rFonts w:ascii="Times New Roman" w:hAnsi="Times New Roman" w:cs="Times New Roman"/>
-        </w:rPr>
-        <w:t xml:space="preserve"> is exactly what motivated me to add a temporal component to my GNN design.</w:t>
+        <w:t>Basak et al. (2025) used GNNs for intrusion detection on UNSW-NB15. They built graphs from flow features with edges linking similar flows. They got F1 over 97%. However, a key limitation is that they used static graphs. The whole dataset was one snapshot. They did not capture how behaviour changes over time. Also, UNSW-NB15 is older and has fewer attack types than CICIoT2023. Han et al. (2025) proposed DIMK-GCN for intrusion detection and showed that multi-scale graph representations can capture both local and global attack patterns. Ngo et al. (2025) used GNNs on IoT datasets with kNN-based graph construction. Edges linked flows that were similar in feature space. This worked without needing device topology. They found k=5 is a good default. However, they also used static graphs with no temporal modelling. This gap is exactly what motivated me to add a temporal component to my GNN design.</w:t>
       </w:r>
     </w:p>
     <w:p>
@@ -3467,13 +3192,7 @@
         <w:rPr>
           <w:rFonts w:ascii="Times New Roman" w:hAnsi="Times New Roman" w:cs="Times New Roman"/>
         </w:rPr>
-        <w:t>My project builds on these studies. I add a GRU layer that processes sequences of graph snapshots. So the system can learn from how the graph changes over time, not just from singl</w:t>
-      </w:r>
-      <w:r>
-        <w:rPr>
-          <w:rFonts w:ascii="Times New Roman" w:hAnsi="Times New Roman" w:cs="Times New Roman"/>
-        </w:rPr>
-        <w:t>e snapshots. Figure 2 shows the conceptual flow of this dynamic GNN architecture.</w:t>
+        <w:t>My project builds on these studies. I add a GRU layer that processes sequences of graph snapshots. So the system can learn from how the graph changes over time, not just from single snapshots. Figure 2 shows the conceptual flow of this dynamic GNN architecture.</w:t>
       </w:r>
     </w:p>
     <w:p>
@@ -3570,13 +3289,7 @@
         <w:rPr>
           <w:rFonts w:ascii="Times New Roman" w:hAnsi="Times New Roman" w:cs="Times New Roman"/>
         </w:rPr>
-        <w:t>1.4 Fed</w:t>
-      </w:r>
-      <w:r>
-        <w:rPr>
-          <w:rFonts w:ascii="Times New Roman" w:hAnsi="Times New Roman" w:cs="Times New Roman"/>
-        </w:rPr>
-        <w:t>erated Learning for Privacy-Preserving IoT Security</w:t>
+        <w:t>1.4 Federated Learning for Privacy-Preserving IoT Security</w:t>
       </w:r>
       <w:bookmarkEnd w:id="8"/>
     </w:p>
@@ -3591,19 +3304,7 @@
         <w:rPr>
           <w:rFonts w:ascii="Times New Roman" w:hAnsi="Times New Roman" w:cs="Times New Roman"/>
         </w:rPr>
-        <w:t>In federated learning, several clients can train a shared model together, but none of them have to send their raw data to a central server. This helps with privacy and regulations like GDPR (McMahan et al</w:t>
-      </w:r>
-      <w:r>
-        <w:rPr>
-          <w:rFonts w:ascii="Times New Roman" w:hAnsi="Times New Roman" w:cs="Times New Roman"/>
-        </w:rPr>
-        <w:t>., 2017). In FedAvg, each client trains on its own data and only sends model updates to a server. The server averages these updates and sends the improved model back to all clients. This fits IoT security well because traffic data often comes from differen</w:t>
-      </w:r>
-      <w:r>
-        <w:rPr>
-          <w:rFonts w:ascii="Times New Roman" w:hAnsi="Times New Roman" w:cs="Times New Roman"/>
-        </w:rPr>
-        <w:t>t organisations or places and cannot be pooled in one location. Figure 3 shows the FedAvg flow used in this project.</w:t>
+        <w:t>In federated learning, several clients can train a shared model together, but none of them have to send their raw data to a central server. This helps with privacy and regulations like GDPR (McMahan et al., 2017). In FedAvg, each client trains on its own data and only sends model updates to a server. The server averages these updates and sends the improved model back to all clients. This fits IoT security well because traffic data often comes from different organisations or places and cannot be pooled in one location. Figure 3 shows the FedAvg flow used in this project.</w:t>
       </w:r>
     </w:p>
     <w:p>
@@ -3699,19 +3400,7 @@
         <w:rPr>
           <w:rFonts w:ascii="Times New Roman" w:hAnsi="Times New Roman" w:cs="Times New Roman"/>
         </w:rPr>
-        <w:t>Lazzari</w:t>
-      </w:r>
-      <w:r>
-        <w:rPr>
-          <w:rFonts w:ascii="Times New Roman" w:hAnsi="Times New Roman" w:cs="Times New Roman"/>
-        </w:rPr>
-        <w:t>ni et al. (2023) used federated learning for intrusion detection on UNSW-NB15. Their federated MLP got within 2% F1 of the centralised model. However, they only used two clients with IID (evenly distributed) data. This is an ideal case that does not reflec</w:t>
-      </w:r>
-      <w:r>
-        <w:rPr>
-          <w:rFonts w:ascii="Times New Roman" w:hAnsi="Times New Roman" w:cs="Times New Roman"/>
-        </w:rPr>
-        <w:t>t real IoT deployments. In practice, different networks (for example, factory sensors compared to smart homes) see very different traffic patterns. This non-IID data is known to hurt FedAvg performance (Kairouz et al., 2021).</w:t>
+        <w:t>Lazzarini et al. (2023) used federated learning for intrusion detection on UNSW-NB15. Their federated MLP got within 2% F1 of the centralised model. However, they only used two clients with IID (evenly distributed) data. This is an ideal case that does not reflect real IoT deployments. In practice, different networks (for example, factory sensors compared to smart homes) see very different traffic patterns. This non-IID data is known to hurt FedAvg performance (Kairouz et al., 2021).</w:t>
       </w:r>
     </w:p>
     <w:p>
@@ -3725,25 +3414,7 @@
         <w:rPr>
           <w:rFonts w:ascii="Times New Roman" w:hAnsi="Times New Roman" w:cs="Times New Roman"/>
         </w:rPr>
-        <w:t>Albanbay et al. (2025) address</w:t>
-      </w:r>
-      <w:r>
-        <w:rPr>
-          <w:rFonts w:ascii="Times New Roman" w:hAnsi="Times New Roman" w:cs="Times New Roman"/>
-        </w:rPr>
-        <w:t>ed non-IID data by using Dirichlet splits. Lower alpha values (meaning more different data across clients) caused up to 8% F1 drop. It also needed about twice as many rounds to converge. However, they used flat models, not graph models. It is still unclear</w:t>
-      </w:r>
-      <w:r>
-        <w:rPr>
-          <w:rFonts w:ascii="Times New Roman" w:hAnsi="Times New Roman" w:cs="Times New Roman"/>
-        </w:rPr>
-        <w:t xml:space="preserve"> whether graph-based models behave differently with non-IID data. My project tests this by combining GNNs with federated learning using alpha=0.5. I chose alpha=0.5 because it creates a noticeable difference between clients without making the problem impos</w:t>
-      </w:r>
-      <w:r>
-        <w:rPr>
-          <w:rFonts w:ascii="Times New Roman" w:hAnsi="Times New Roman" w:cs="Times New Roman"/>
-        </w:rPr>
-        <w:t>sibly hard for initial experiments.</w:t>
+        <w:t>Albanbay et al. (2025) addressed non-IID data by using Dirichlet splits. Lower alpha values (meaning more different data across clients) caused up to 8% F1 drop. It also needed about twice as many rounds to converge. However, they used flat models, not graph models. It is still unclear whether graph-based models behave differently with non-IID data. My project tests this by combining GNNs with federated learning using alpha=0.5. I chose alpha=0.5 because it creates a noticeable difference between clients without making the problem impossibly hard for initial experiments.</w:t>
       </w:r>
     </w:p>
     <w:p>
@@ -3774,13 +3445,7 @@
         <w:rPr>
           <w:rFonts w:ascii="Times New Roman" w:hAnsi="Times New Roman" w:cs="Times New Roman"/>
         </w:rPr>
-        <w:t>One well-known problem in SOCs is that analysts get far too many alerts each day, and many of them turn out to be false (Alahmadi et al., 2022). Cuppens and Miege (2002) propose</w:t>
-      </w:r>
-      <w:r>
-        <w:rPr>
-          <w:rFonts w:ascii="Times New Roman" w:hAnsi="Times New Roman" w:cs="Times New Roman"/>
-        </w:rPr>
-        <w:t>d alert correlation to reduce noise, but the main problem remains: many detection systems output labels without saying why. ML models that only give a yes or no answer make this problem worse.</w:t>
+        <w:t>One well-known problem in SOCs is that analysts get far too many alerts each day, and many of them turn out to be false (Alahmadi et al., 2022). Cuppens and Miege (2002) proposed alert correlation to reduce noise, but the main problem remains: many detection systems output labels without saying why. ML models that only give a yes or no answer make this problem worse.</w:t>
       </w:r>
     </w:p>
     <w:p>
@@ -3794,32 +3459,14 @@
         <w:rPr>
           <w:rFonts w:ascii="Times New Roman" w:hAnsi="Times New Roman" w:cs="Times New Roman"/>
         </w:rPr>
-        <w:t>Explainable AI (XAI) helps by showing which input features drov</w:t>
-      </w:r>
-      <w:r>
-        <w:rPr>
-          <w:rFonts w:ascii="Times New Roman" w:hAnsi="Times New Roman" w:cs="Times New Roman"/>
-        </w:rPr>
-        <w:t xml:space="preserve">e each decision. Integrated Gradients (Sundararajan, Taly and Yan, 2017) does this by following a path from a baseline to the </w:t>
+        <w:t xml:space="preserve">Explainable AI (XAI) helps by showing which input features drove each decision. Integrated Gradients (Sundararajan, Taly and Yan, 2017) does this by following a path from a baseline to the </w:t>
       </w:r>
       <w:r>
         <w:rPr>
           <w:rFonts w:ascii="Times New Roman" w:hAnsi="Times New Roman" w:cs="Times New Roman"/>
         </w:rPr>
         <w:lastRenderedPageBreak/>
-        <w:t>real input. It has good mathematical properties. Captum (Kokhlikyan et al., 2020) implements Integrated Gradients for PyTorch. I u</w:t>
-      </w:r>
-      <w:r>
-        <w:rPr>
-          <w:rFonts w:ascii="Times New Roman" w:hAnsi="Times New Roman" w:cs="Times New Roman"/>
-        </w:rPr>
-        <w:t>se Captum in my project. Alabbadi and Bajaber (2025) used SHAP for IoT intrusion detection. Feature attribution helped analysts trust the alerts. However, SHAP is slow for deep models. One prediction can take over 10 seconds. That is too slow for real-time</w:t>
-      </w:r>
-      <w:r>
-        <w:rPr>
-          <w:rFonts w:ascii="Times New Roman" w:hAnsi="Times New Roman" w:cs="Times New Roman"/>
-        </w:rPr>
-        <w:t xml:space="preserve"> or edge use. I picked Integrated Gradients over SHAP mainly because it is faster — it only needs a single forward and backward pass through the network, which matters when running on CPU.</w:t>
+        <w:t>real input. It has good mathematical properties. Captum (Kokhlikyan et al., 2020) implements Integrated Gradients for PyTorch. I use Captum in my project. Alabbadi and Bajaber (2025) used SHAP for IoT intrusion detection. Feature attribution helped analysts trust the alerts. However, SHAP is slow for deep models. One prediction can take over 10 seconds. That is too slow for real-time or edge use. I picked Integrated Gradients over SHAP mainly because it is faster — it only needs a single forward and backward pass through the network, which matters when running on CPU.</w:t>
       </w:r>
     </w:p>
     <w:p>
@@ -3833,19 +3480,7 @@
         <w:rPr>
           <w:rFonts w:ascii="Times New Roman" w:hAnsi="Times New Roman" w:cs="Times New Roman"/>
         </w:rPr>
-        <w:t>GAT attention weights provide another form of explanation. They sho</w:t>
-      </w:r>
-      <w:r>
-        <w:rPr>
-          <w:rFonts w:ascii="Times New Roman" w:hAnsi="Times New Roman" w:cs="Times New Roman"/>
-        </w:rPr>
-        <w:t>w which neighbour flows influenced each classification. No prior work I found combines both approaches: feature attributions from Integrated Gradients and structural explanations from attention weights. I use both in my project to give analysts richer cont</w:t>
-      </w:r>
-      <w:r>
-        <w:rPr>
-          <w:rFonts w:ascii="Times New Roman" w:hAnsi="Times New Roman" w:cs="Times New Roman"/>
-        </w:rPr>
-        <w:t>ext for each alert. Figure 4 shows the explainability pipeline used in this project.</w:t>
+        <w:t>GAT attention weights provide another form of explanation. They show which neighbour flows influenced each classification. No prior work I found combines both approaches: feature attributions from Integrated Gradients and structural explanations from attention weights. I use both in my project to give analysts richer context for each alert. Figure 4 shows the explainability pipeline used in this project.</w:t>
       </w:r>
     </w:p>
     <w:p>
@@ -3926,14 +3561,7 @@
           <w:rFonts w:ascii="Times New Roman" w:hAnsi="Times New Roman" w:cs="Times New Roman"/>
           <w:i/>
         </w:rPr>
-        <w:t xml:space="preserve">Sources: Sundararajan et al. (2017); Velickovic et al. (2018); Kokhlikyan et </w:t>
-      </w:r>
-      <w:r>
-        <w:rPr>
-          <w:rFonts w:ascii="Times New Roman" w:hAnsi="Times New Roman" w:cs="Times New Roman"/>
-          <w:i/>
-        </w:rPr>
-        <w:t>al. (2020).</w:t>
+        <w:t>Sources: Sundararajan et al. (2017); Velickovic et al. (2018); Kokhlikyan et al. (2020).</w:t>
       </w:r>
     </w:p>
     <w:p>
@@ -3979,14 +3607,7 @@
           <w:rFonts w:ascii="Times New Roman" w:hAnsi="Times New Roman" w:cs="Times New Roman"/>
           <w:b/>
         </w:rPr>
-        <w:t>Table 1: Comparison</w:t>
-      </w:r>
-      <w:r>
-        <w:rPr>
-          <w:rFonts w:ascii="Times New Roman" w:hAnsi="Times New Roman" w:cs="Times New Roman"/>
-          <w:b/>
-        </w:rPr>
-        <w:t xml:space="preserve"> of Related Work Against Project Pillars</w:t>
+        <w:t>Table 1: Comparison of Related Work Against Project Pillars</w:t>
       </w:r>
     </w:p>
     <w:tbl>
@@ -5291,19 +4912,7 @@
         <w:rPr>
           <w:rFonts w:ascii="Times New Roman" w:hAnsi="Times New Roman" w:cs="Times New Roman"/>
         </w:rPr>
-        <w:t xml:space="preserve">No study I found </w:t>
-      </w:r>
-      <w:r>
-        <w:rPr>
-          <w:rFonts w:ascii="Times New Roman" w:hAnsi="Times New Roman" w:cs="Times New Roman"/>
-        </w:rPr>
-        <w:t>combines all four of these in one system: dynamic GNN with temporal modelling, federated learning with non-IID data, dual explainability (feature-level and structural), and SIEM-style alerts. Figure 5 shows the positioning of related work against these fou</w:t>
-      </w:r>
-      <w:r>
-        <w:rPr>
-          <w:rFonts w:ascii="Times New Roman" w:hAnsi="Times New Roman" w:cs="Times New Roman"/>
-        </w:rPr>
-        <w:t>r pillars. My project fills this gap. I am building a system that has all four components and runs on CPU for edge deployment, using the CICIoT2023 dataset.</w:t>
+        <w:t>No study I found combines all four of these in one system: dynamic GNN with temporal modelling, federated learning with non-IID data, dual explainability (feature-level and structural), and SIEM-style alerts. Figure 5 shows the positioning of related work against these four pillars. My project fills this gap. I am building a system that has all four components and runs on CPU for edge deployment, using the CICIoT2023 dataset.</w:t>
       </w:r>
     </w:p>
     <w:p>
@@ -5408,6 +5017,7 @@
           <w:rFonts w:ascii="Times New Roman" w:hAnsi="Times New Roman" w:cs="Times New Roman"/>
         </w:rPr>
       </w:pPr>
+      <w:bookmarkStart w:id="11" w:name="_GoBack"/>
       <w:r>
         <w:rPr>
           <w:rFonts w:ascii="Times New Roman" w:hAnsi="Times New Roman" w:cs="Times New Roman"/>
@@ -5416,8 +5026,8 @@
         <w:lastRenderedPageBreak/>
         <w:drawing>
           <wp:inline distT="0" distB="0" distL="0" distR="0">
-            <wp:extent cx="4572000" cy="3048000"/>
-            <wp:effectExtent l="0" t="0" r="0" b="0"/>
+            <wp:extent cx="5749290" cy="3832860"/>
+            <wp:effectExtent l="0" t="0" r="3810" b="0"/>
             <wp:docPr id="6" name="Picture 6"/>
             <wp:cNvGraphicFramePr>
               <a:graphicFrameLocks xmlns:a="http://schemas.openxmlformats.org/drawingml/2006/main" noChangeAspect="1"/>
@@ -5438,7 +5048,7 @@
                   <pic:spPr>
                     <a:xfrm>
                       <a:off x="0" y="0"/>
-                      <a:ext cx="4572000" cy="3048000"/>
+                      <a:ext cx="5749290" cy="3832860"/>
                     </a:xfrm>
                     <a:prstGeom prst="rect">
                       <a:avLst/>
@@ -5450,6 +5060,7 @@
           </wp:inline>
         </w:drawing>
       </w:r>
+      <w:bookmarkEnd w:id="11"/>
     </w:p>
     <w:p>
       <w:pPr>
@@ -5467,15 +5078,7 @@
           <w:i/>
           <w:sz w:val="20"/>
         </w:rPr>
-        <w:t>Figure 6: Project integrat</w:t>
-      </w:r>
-      <w:r>
-        <w:rPr>
-          <w:rFonts w:ascii="Times New Roman" w:hAnsi="Times New Roman" w:cs="Times New Roman"/>
-          <w:i/>
-          <w:sz w:val="20"/>
-        </w:rPr>
-        <w:t>ion of four literature pillars.</w:t>
+        <w:t>Figure 6: Project integration of four literature pillars.</w:t>
       </w:r>
     </w:p>
     <w:p>
@@ -5597,13 +5200,10 @@
           <w:rFonts w:ascii="Times New Roman" w:hAnsi="Times New Roman" w:cs="Times New Roman"/>
         </w:rPr>
       </w:pPr>
-      <w:bookmarkStart w:id="11" w:name="_GoBack"/>
-      <w:bookmarkEnd w:id="11"/>
-      <w:r>
-        <w:rPr>
-          <w:rFonts w:ascii="Times New Roman" w:hAnsi="Times New Roman" w:cs="Times New Roman"/>
-        </w:rPr>
-        <w:lastRenderedPageBreak/>
+      <w:r>
+        <w:rPr>
+          <w:rFonts w:ascii="Times New Roman" w:hAnsi="Times New Roman" w:cs="Times New Roman"/>
+        </w:rPr>
         <w:t>Finally, Figure 7 presents the end-to-end project pipeline, included here to show how the literature insights are translated into an operational research design.</w:t>
       </w:r>
     </w:p>
@@ -5670,15 +5270,7 @@
           <w:i/>
           <w:sz w:val="20"/>
         </w:rPr>
-        <w:t>Figure 7: End-to-end research pipeline aligned with literatu</w:t>
-      </w:r>
-      <w:r>
-        <w:rPr>
-          <w:rFonts w:ascii="Times New Roman" w:hAnsi="Times New Roman" w:cs="Times New Roman"/>
-          <w:i/>
-          <w:sz w:val="20"/>
-        </w:rPr>
-        <w:t>re findings.</w:t>
+        <w:t>Figure 7: End-to-end research pipeline aligned with literature findings.</w:t>
       </w:r>
     </w:p>
     <w:p>
@@ -5694,6 +5286,7 @@
         <w:rPr>
           <w:rFonts w:ascii="Times New Roman" w:hAnsi="Times New Roman" w:cs="Times New Roman"/>
         </w:rPr>
+        <w:lastRenderedPageBreak/>
         <w:t>2. Research Methodology</w:t>
       </w:r>
       <w:bookmarkEnd w:id="12"/>
@@ -5725,7 +5318,6 @@
         <w:rPr>
           <w:rFonts w:ascii="Times New Roman" w:hAnsi="Times New Roman" w:cs="Times New Roman"/>
         </w:rPr>
-        <w:lastRenderedPageBreak/>
         <w:t>2.1 Research Approach and Basis</w:t>
       </w:r>
       <w:bookmarkEnd w:id="13"/>
@@ -5741,19 +5333,7 @@
         <w:rPr>
           <w:rFonts w:ascii="Times New Roman" w:hAnsi="Times New Roman" w:cs="Times New Roman"/>
         </w:rPr>
-        <w:t>For this project, I took a quantitative, exper</w:t>
-      </w:r>
-      <w:r>
-        <w:rPr>
-          <w:rFonts w:ascii="Times New Roman" w:hAnsi="Times New Roman" w:cs="Times New Roman"/>
-        </w:rPr>
-        <w:t>imental approach. I design, build and compare several detection models under controlled conditions. I measure metrics like precision, recall, F1, ROC-AUC, false alarm rate and CPU inference time. The test set is held out and never used during training. Eac</w:t>
-      </w:r>
-      <w:r>
-        <w:rPr>
-          <w:rFonts w:ascii="Times New Roman" w:hAnsi="Times New Roman" w:cs="Times New Roman"/>
-        </w:rPr>
-        <w:t>h model is tested against the hypotheses below.</w:t>
+        <w:t>For this project, I took a quantitative, experimental approach. I design, build and compare several detection models under controlled conditions. I measure metrics like precision, recall, F1, ROC-AUC, false alarm rate and CPU inference time. The test set is held out and never used during training. Each model is tested against the hypotheses below.</w:t>
       </w:r>
     </w:p>
     <w:p>
@@ -5774,13 +5354,7 @@
         <w:rPr>
           <w:rFonts w:ascii="Times New Roman" w:hAnsi="Times New Roman" w:cs="Times New Roman"/>
         </w:rPr>
-        <w:t xml:space="preserve"> How can an explainable dynamic graph neural network, trained using federated learning, detect attacks in Software-Defined IoT flow data and generate SIEM alerts that support SOC ope</w:t>
-      </w:r>
-      <w:r>
-        <w:rPr>
-          <w:rFonts w:ascii="Times New Roman" w:hAnsi="Times New Roman" w:cs="Times New Roman"/>
-        </w:rPr>
-        <w:t>rations on CPU-based edge devices?</w:t>
+        <w:t xml:space="preserve"> How can an explainable dynamic graph neural network, trained using federated learning, detect attacks in Software-Defined IoT flow data and generate SIEM alerts that support SOC operations on CPU-based edge devices?</w:t>
       </w:r>
     </w:p>
     <w:p>
@@ -5839,13 +5413,7 @@
         <w:rPr>
           <w:rFonts w:ascii="Times New Roman" w:hAnsi="Times New Roman" w:cs="Times New Roman"/>
         </w:rPr>
-        <w:t xml:space="preserve"> The federated GNN achieves F1</w:t>
-      </w:r>
-      <w:r>
-        <w:rPr>
-          <w:rFonts w:ascii="Times New Roman" w:hAnsi="Times New Roman" w:cs="Times New Roman"/>
-        </w:rPr>
-        <w:t xml:space="preserve"> within 2% of the centralised GNN, showing that privacy-preserving training does not substantially degrade detection performance.</w:t>
+        <w:t xml:space="preserve"> The federated GNN achieves F1 within 2% of the centralised GNN, showing that privacy-preserving training does not substantially degrade detection performance.</w:t>
       </w:r>
     </w:p>
     <w:p>
@@ -5867,13 +5435,7 @@
         <w:rPr>
           <w:rFonts w:ascii="Times New Roman" w:hAnsi="Times New Roman" w:cs="Times New Roman"/>
         </w:rPr>
-        <w:t xml:space="preserve"> Integrated Gradients and GAT attention weights produce feature attributions and flow-level explanations that identify atta</w:t>
-      </w:r>
-      <w:r>
-        <w:rPr>
-          <w:rFonts w:ascii="Times New Roman" w:hAnsi="Times New Roman" w:cs="Times New Roman"/>
-        </w:rPr>
-        <w:t>ck-relevant features (such as TCP flags and protocol indicators) in the generated SIEM alerts.</w:t>
+        <w:t xml:space="preserve"> Integrated Gradients and GAT attention weights produce feature attributions and flow-level explanations that identify attack-relevant features (such as TCP flags and protocol indicators) in the generated SIEM alerts.</w:t>
       </w:r>
     </w:p>
     <w:p>
@@ -5904,19 +5466,7 @@
         <w:rPr>
           <w:rFonts w:ascii="Times New Roman" w:hAnsi="Times New Roman" w:cs="Times New Roman"/>
         </w:rPr>
-        <w:t>I use the CICIoT2023 dataset (Pinto Neto et al., 2023). It has flow-level records with 46 numeric features including packet counts,</w:t>
-      </w:r>
-      <w:r>
-        <w:rPr>
-          <w:rFonts w:ascii="Times New Roman" w:hAnsi="Times New Roman" w:cs="Times New Roman"/>
-        </w:rPr>
-        <w:t xml:space="preserve"> byte counts, flow duration, protocol indicators (TCP, UDP, ICMP, HTTP, DNS), TCP flag counts (SYN, ACK, RST, PSH, FIN), and statistical measures (mean, variance, standard deviation). Labels cover benign traffic and 34 attack types including DDoS, DoS, rec</w:t>
-      </w:r>
-      <w:r>
-        <w:rPr>
-          <w:rFonts w:ascii="Times New Roman" w:hAnsi="Times New Roman" w:cs="Times New Roman"/>
-        </w:rPr>
-        <w:t>onnaissance, brute force and spoofing. A manageable subset of 500,000 flows per split is selected to fit the 15-week timeline.</w:t>
+        <w:t>I use the CICIoT2023 dataset (Pinto Neto et al., 2023). It has flow-level records with 46 numeric features including packet counts, byte counts, flow duration, protocol indicators (TCP, UDP, ICMP, HTTP, DNS), TCP flag counts (SYN, ACK, RST, PSH, FIN), and statistical measures (mean, variance, standard deviation). Labels cover benign traffic and 34 attack types including DDoS, DoS, reconnaissance, brute force and spoofing. A manageable subset of 500,000 flows per split is selected to fit the 15-week timeline.</w:t>
       </w:r>
     </w:p>
     <w:p>
@@ -5969,13 +5519,7 @@
         <w:rPr>
           <w:rFonts w:ascii="Times New Roman" w:hAnsi="Times New Roman" w:cs="Times New Roman"/>
         </w:rPr>
-        <w:t xml:space="preserve">Map the 35 original labels to binary </w:t>
-      </w:r>
-      <w:r>
-        <w:rPr>
-          <w:rFonts w:ascii="Times New Roman" w:hAnsi="Times New Roman" w:cs="Times New Roman"/>
-        </w:rPr>
-        <w:t>classes: 0 (Benign) and 1 (Attack).</w:t>
+        <w:t>Map the 35 original labels to binary classes: 0 (Benign) and 1 (Attack).</w:t>
       </w:r>
     </w:p>
     <w:p>
@@ -5994,13 +5538,8 @@
         <w:rPr>
           <w:rFonts w:ascii="Times New Roman" w:hAnsi="Times New Roman" w:cs="Times New Roman"/>
         </w:rPr>
-        <w:t>Apply StandardScaler (fitted on training data only) to normalise all 46 features to zero mean and unit variance. Save the fitted scaler so the same transformation is applied to validation and test sets without data leaka</w:t>
-      </w:r>
-      <w:r>
-        <w:rPr>
-          <w:rFonts w:ascii="Times New Roman" w:hAnsi="Times New Roman" w:cs="Times New Roman"/>
-        </w:rPr>
-        <w:t>ge.</w:t>
+        <w:lastRenderedPageBreak/>
+        <w:t>Apply StandardScaler (fitted on training data only) to normalise all 46 features to zero mean and unit variance. Save the fitted scaler so the same transformation is applied to validation and test sets without data leakage.</w:t>
       </w:r>
     </w:p>
     <w:p>
@@ -6033,14 +5572,7 @@
         <w:rPr>
           <w:rFonts w:ascii="Times New Roman" w:hAnsi="Times New Roman" w:cs="Times New Roman"/>
         </w:rPr>
-        <w:lastRenderedPageBreak/>
-        <w:t xml:space="preserve">I chose binary classification rather than multi-class because the most important question for a SOC analyst is simply whether traffic is malicious or not. Adding more attack </w:t>
-      </w:r>
-      <w:r>
-        <w:rPr>
-          <w:rFonts w:ascii="Times New Roman" w:hAnsi="Times New Roman" w:cs="Times New Roman"/>
-        </w:rPr>
-        <w:t>categories is something I can look at later if time allows.</w:t>
+        <w:t>I chose binary classification rather than multi-class because the most important question for a SOC analyst is simply whether traffic is malicious or not. Adding more attack categories is something I can look at later if time allows.</w:t>
       </w:r>
     </w:p>
     <w:p>
@@ -6071,13 +5603,7 @@
         <w:rPr>
           <w:rFonts w:ascii="Times New Roman" w:hAnsi="Times New Roman" w:cs="Times New Roman"/>
         </w:rPr>
-        <w:t xml:space="preserve">The public version of CICIoT2023 has no device IDs or IP addresses. So I cannot build a device-topology graph. Instead, I follow the approach of Ngo et </w:t>
-      </w:r>
-      <w:r>
-        <w:rPr>
-          <w:rFonts w:ascii="Times New Roman" w:hAnsi="Times New Roman" w:cs="Times New Roman"/>
-        </w:rPr>
-        <w:t>al. (2025) and Basak et al. (2025) and build graphs from feature similarity:</w:t>
+        <w:t>The public version of CICIoT2023 has no device IDs or IP addresses. So I cannot build a device-topology graph. Instead, I follow the approach of Ngo et al. (2025) and Basak et al. (2025) and build graphs from feature similarity:</w:t>
       </w:r>
     </w:p>
     <w:p>
@@ -6143,13 +5669,7 @@
         <w:rPr>
           <w:rFonts w:ascii="Times New Roman" w:hAnsi="Times New Roman" w:cs="Times New Roman"/>
         </w:rPr>
-        <w:t xml:space="preserve"> 50 flows per window. This gives enough nodes for the GAT to learn meaning</w:t>
-      </w:r>
-      <w:r>
-        <w:rPr>
-          <w:rFonts w:ascii="Times New Roman" w:hAnsi="Times New Roman" w:cs="Times New Roman"/>
-        </w:rPr>
-        <w:t>ful patterns, while keeping computation fast enough for CPU inference.</w:t>
+        <w:t xml:space="preserve"> 50 flows per window. This gives enough nodes for the GAT to learn meaningful patterns, while keeping computation fast enough for CPU inference.</w:t>
       </w:r>
     </w:p>
     <w:p>
@@ -6193,19 +5713,7 @@
         <w:rPr>
           <w:rFonts w:ascii="Times New Roman" w:hAnsi="Times New Roman" w:cs="Times New Roman"/>
         </w:rPr>
-        <w:t xml:space="preserve"> The dataset</w:t>
-      </w:r>
-      <w:r>
-        <w:rPr>
-          <w:rFonts w:ascii="Times New Roman" w:hAnsi="Times New Roman" w:cs="Times New Roman"/>
-        </w:rPr>
-        <w:t xml:space="preserve"> is heavily imbalanced (approximately 97.8% attack, 2.2% benign at flow level). To handle this, benign and attack flows are separated into pools. Windows are built from each pool independently. Minority-class windows use an overlapping stride (25 flows) fo</w:t>
-      </w:r>
-      <w:r>
-        <w:rPr>
-          <w:rFonts w:ascii="Times New Roman" w:hAnsi="Times New Roman" w:cs="Times New Roman"/>
-        </w:rPr>
-        <w:t>r augmentation. Sequences are then balanced and shuffled before training.</w:t>
+        <w:t xml:space="preserve"> The dataset is heavily imbalanced (approximately 97.8% attack, 2.2% benign at flow level). To handle this, benign and attack flows are separated into pools. Windows are built from each pool independently. Minority-class windows use an overlapping stride (25 flows) for augmentation. Sequences are then balanced and shuffled before training.</w:t>
       </w:r>
     </w:p>
     <w:p>
@@ -6251,14 +5759,7 @@
           <w:rFonts w:ascii="Times New Roman" w:hAnsi="Times New Roman" w:cs="Times New Roman"/>
           <w:b/>
         </w:rPr>
-        <w:t>Table 2: Summary of</w:t>
-      </w:r>
-      <w:r>
-        <w:rPr>
-          <w:rFonts w:ascii="Times New Roman" w:hAnsi="Times New Roman" w:cs="Times New Roman"/>
-          <w:b/>
-        </w:rPr>
-        <w:t xml:space="preserve"> Model Architectures</w:t>
+        <w:t>Table 2: Summary of Model Architectures</w:t>
       </w:r>
     </w:p>
     <w:tbl>
@@ -6592,6 +6093,7 @@
                 <w:rFonts w:ascii="Times New Roman" w:hAnsi="Times New Roman" w:cs="Times New Roman"/>
                 <w:sz w:val="20"/>
               </w:rPr>
+              <w:lastRenderedPageBreak/>
               <w:t>MLP</w:t>
             </w:r>
           </w:p>
@@ -6786,14 +6288,7 @@
                 <w:rFonts w:ascii="Times New Roman" w:hAnsi="Times New Roman" w:cs="Times New Roman"/>
                 <w:sz w:val="20"/>
               </w:rPr>
-              <w:t xml:space="preserve">kNN </w:t>
-            </w:r>
-            <w:r>
-              <w:rPr>
-                <w:rFonts w:ascii="Times New Roman" w:hAnsi="Times New Roman" w:cs="Times New Roman"/>
-                <w:sz w:val="20"/>
-              </w:rPr>
-              <w:t>graph sequences</w:t>
+              <w:t>kNN graph sequences</w:t>
             </w:r>
           </w:p>
         </w:tc>
@@ -6879,7 +6374,6 @@
                 <w:rFonts w:ascii="Times New Roman" w:hAnsi="Times New Roman" w:cs="Times New Roman"/>
                 <w:sz w:val="20"/>
               </w:rPr>
-              <w:lastRenderedPageBreak/>
               <w:t>Federated GNN</w:t>
             </w:r>
           </w:p>
@@ -7035,13 +6529,7 @@
         <w:rPr>
           <w:rFonts w:ascii="Times New Roman" w:hAnsi="Times New Roman" w:cs="Times New Roman"/>
         </w:rPr>
-        <w:t xml:space="preserve"> Three hidden layers (128, 64, 32 neurons) with ReLU activation and </w:t>
-      </w:r>
-      <w:r>
-        <w:rPr>
-          <w:rFonts w:ascii="Times New Roman" w:hAnsi="Times New Roman" w:cs="Times New Roman"/>
-        </w:rPr>
-        <w:t>20% dropout. Trained on the same flat features. This provides a neural baseline without graph or temporal components.</w:t>
+        <w:t xml:space="preserve"> Three hidden layers (128, 64, 32 neurons) with ReLU activation and 20% dropout. Trained on the same flat features. This provides a neural baseline without graph or temporal components.</w:t>
       </w:r>
     </w:p>
     <w:p>
@@ -7063,13 +6551,7 @@
         <w:rPr>
           <w:rFonts w:ascii="Times New Roman" w:hAnsi="Times New Roman" w:cs="Times New Roman"/>
         </w:rPr>
-        <w:t xml:space="preserve"> This is the core model. It has: (1) two GAT convolutional layers (4 attention heads, hidden dimensio</w:t>
-      </w:r>
-      <w:r>
-        <w:rPr>
-          <w:rFonts w:ascii="Times New Roman" w:hAnsi="Times New Roman" w:cs="Times New Roman"/>
-        </w:rPr>
-        <w:t>n 64); (2) global mean pooling to get one vector per graph snapshot; (3) a GRU recurrent layer (hidden dimension 64) that processes the sequence of 5 graph embeddings; (4) a fully connected classifier that produces binary attack/benign probability.</w:t>
+        <w:t xml:space="preserve"> This is the core model. It has: (1) two GAT convolutional layers (4 attention heads, hidden dimension 64); (2) global mean pooling to get one vector per graph snapshot; (3) a GRU recurrent layer (hidden dimension 64) that processes the sequence of 5 graph embeddings; (4) a fully connected classifier that produces binary attack/benign probability.</w:t>
       </w:r>
     </w:p>
     <w:p>
@@ -7085,26 +6567,13 @@
           <w:rFonts w:ascii="Times New Roman" w:hAnsi="Times New Roman" w:cs="Times New Roman"/>
           <w:b/>
         </w:rPr>
-        <w:t>Federat</w:t>
-      </w:r>
-      <w:r>
-        <w:rPr>
-          <w:rFonts w:ascii="Times New Roman" w:hAnsi="Times New Roman" w:cs="Times New Roman"/>
-          <w:b/>
-        </w:rPr>
-        <w:t>ed Dynamic GNN:</w:t>
-      </w:r>
-      <w:r>
-        <w:rPr>
-          <w:rFonts w:ascii="Times New Roman" w:hAnsi="Times New Roman" w:cs="Times New Roman"/>
-        </w:rPr>
-        <w:t xml:space="preserve"> The same architecture as the centralised GNN, but trained using FedAvg across 3 simulated clients. Data is split using Dirichlet distribution (alpha=0.5) to create non-IID conditions. Training runs for 10 communication rounds with 2 local e</w:t>
-      </w:r>
-      <w:r>
-        <w:rPr>
-          <w:rFonts w:ascii="Times New Roman" w:hAnsi="Times New Roman" w:cs="Times New Roman"/>
-        </w:rPr>
-        <w:t>pochs per round. Flower (Beutel et al., 2020) is used as the federated learning framework.</w:t>
+        <w:t>Federated Dynamic GNN:</w:t>
+      </w:r>
+      <w:r>
+        <w:rPr>
+          <w:rFonts w:ascii="Times New Roman" w:hAnsi="Times New Roman" w:cs="Times New Roman"/>
+        </w:rPr>
+        <w:t xml:space="preserve"> The same architecture as the centralised GNN, but trained using FedAvg across 3 simulated clients. Data is split using Dirichlet distribution (alpha=0.5) to create non-IID conditions. Training runs for 10 communication rounds with 2 local epochs per round. Flower (Beutel et al., 2020) is used as the federated learning framework.</w:t>
       </w:r>
     </w:p>
     <w:p>
@@ -7135,25 +6604,7 @@
         <w:rPr>
           <w:rFonts w:ascii="Times New Roman" w:hAnsi="Times New Roman" w:cs="Times New Roman"/>
         </w:rPr>
-        <w:t xml:space="preserve">I use the pre-defined train/validation/test splits from CICIoT2023. This lets me compare my results with other papers that use the </w:t>
-      </w:r>
-      <w:r>
-        <w:rPr>
-          <w:rFonts w:ascii="Times New Roman" w:hAnsi="Times New Roman" w:cs="Times New Roman"/>
-        </w:rPr>
-        <w:t>same dataset. I use the validation set for hyperparameter tuning and early stopping (patience=5 epochs). The test set is reserved only for final evaluation. A fixed random seed (42) makes results reproducible. I use class-weighted loss for all neural model</w:t>
-      </w:r>
-      <w:r>
-        <w:rPr>
-          <w:rFonts w:ascii="Times New Roman" w:hAnsi="Times New Roman" w:cs="Times New Roman"/>
-        </w:rPr>
-        <w:t>s. This prevents the model from simply predicting the majority class. One challenge I faced during data preparation was handling the extreme class imbalance at flow level. The raw data had about 97.8% attack flows and only 2.2% benign flows. If I trained o</w:t>
-      </w:r>
-      <w:r>
-        <w:rPr>
-          <w:rFonts w:ascii="Times New Roman" w:hAnsi="Times New Roman" w:cs="Times New Roman"/>
-        </w:rPr>
-        <w:t>n this directly, the model would just predict attack every time. I solved this by building the stratified windowing strategy described in Section 2.3, which balances the graph-level samples before training.</w:t>
+        <w:t>I use the pre-defined train/validation/test splits from CICIoT2023. This lets me compare my results with other papers that use the same dataset. I use the validation set for hyperparameter tuning and early stopping (patience=5 epochs). The test set is reserved only for final evaluation. A fixed random seed (42) makes results reproducible. I use class-weighted loss for all neural models. This prevents the model from simply predicting the majority class. One challenge I faced during data preparation was handling the extreme class imbalance at flow level. The raw data had about 97.8% attack flows and only 2.2% benign flows. If I trained on this directly, the model would just predict attack every time. I solved this by building the stratified windowing strategy described in Section 2.3, which balances the graph-level samples before training.</w:t>
       </w:r>
     </w:p>
     <w:p>
@@ -7169,6 +6620,7 @@
         <w:rPr>
           <w:rFonts w:ascii="Times New Roman" w:hAnsi="Times New Roman" w:cs="Times New Roman"/>
         </w:rPr>
+        <w:lastRenderedPageBreak/>
         <w:t>2.6 Evaluation Metrics</w:t>
       </w:r>
       <w:bookmarkEnd w:id="18"/>
@@ -7184,13 +6636,7 @@
         <w:rPr>
           <w:rFonts w:ascii="Times New Roman" w:hAnsi="Times New Roman" w:cs="Times New Roman"/>
         </w:rPr>
-        <w:t>I use these metrics becaus</w:t>
-      </w:r>
-      <w:r>
-        <w:rPr>
-          <w:rFonts w:ascii="Times New Roman" w:hAnsi="Times New Roman" w:cs="Times New Roman"/>
-        </w:rPr>
-        <w:t>e they matter for SOC work.</w:t>
+        <w:t>I use these metrics because they matter for SOC work.</w:t>
       </w:r>
     </w:p>
     <w:p>
@@ -7260,7 +6706,6 @@
           <w:rFonts w:ascii="Times New Roman" w:hAnsi="Times New Roman" w:cs="Times New Roman"/>
           <w:b/>
         </w:rPr>
-        <w:lastRenderedPageBreak/>
         <w:t>Recall</w:t>
       </w:r>
       <w:r>
@@ -7432,13 +6877,7 @@
         <w:rPr>
           <w:rFonts w:ascii="Times New Roman" w:hAnsi="Times New Roman" w:cs="Times New Roman"/>
         </w:rPr>
-        <w:t xml:space="preserve"> (Eq. 5): area under th</w:t>
-      </w:r>
-      <w:r>
-        <w:rPr>
-          <w:rFonts w:ascii="Times New Roman" w:hAnsi="Times New Roman" w:cs="Times New Roman"/>
-        </w:rPr>
-        <w:t>e Receiver Operating Characteristic curve. The ROC curve plots true positive rate against false positive rate at varying thresholds. AUC of 1.0 indicates perfect ranking; 0.5 indicates random guessing.</w:t>
+        <w:t xml:space="preserve"> (Eq. 5): area under the Receiver Operating Characteristic curve. The ROC curve plots true positive rate against false positive rate at varying thresholds. AUC of 1.0 indicates perfect ranking; 0.5 indicates random guessing.</w:t>
       </w:r>
     </w:p>
     <w:p>
@@ -7486,13 +6925,7 @@
         <w:rPr>
           <w:rFonts w:ascii="Times New Roman" w:hAnsi="Times New Roman" w:cs="Times New Roman"/>
         </w:rPr>
-        <w:t>I also use a confusion</w:t>
-      </w:r>
-      <w:r>
-        <w:rPr>
-          <w:rFonts w:ascii="Times New Roman" w:hAnsi="Times New Roman" w:cs="Times New Roman"/>
-        </w:rPr>
-        <w:t xml:space="preserve"> matrix, CPU inference time (ms per sample), and communication cost (bytes sent during federated training). False alarm rate matters most for SOCs because high recall with high FAR means too many false alerts.</w:t>
+        <w:t>I also use a confusion matrix, CPU inference time (ms per sample), and communication cost (bytes sent during federated training). False alarm rate matters most for SOCs because high recall with high FAR means too many false alerts.</w:t>
       </w:r>
     </w:p>
     <w:p>
@@ -7523,13 +6956,7 @@
         <w:rPr>
           <w:rFonts w:ascii="Times New Roman" w:hAnsi="Times New Roman" w:cs="Times New Roman"/>
         </w:rPr>
-        <w:t xml:space="preserve">I use </w:t>
-      </w:r>
-      <w:r>
-        <w:rPr>
-          <w:rFonts w:ascii="Times New Roman" w:hAnsi="Times New Roman" w:cs="Times New Roman"/>
-        </w:rPr>
-        <w:t>two methods for explainability:</w:t>
+        <w:t>I use two methods for explainability:</w:t>
       </w:r>
     </w:p>
     <w:p>
@@ -7555,13 +6982,7 @@
         <w:rPr>
           <w:rFonts w:ascii="Times New Roman" w:hAnsi="Times New Roman" w:cs="Times New Roman"/>
         </w:rPr>
-        <w:t xml:space="preserve"> For each flagged flow, feature attributions are computed by accumulating gradients along a path from a zero-valued baseline to the actual input (Eq. 6). The top-5 contributing features are extr</w:t>
-      </w:r>
-      <w:r>
-        <w:rPr>
-          <w:rFonts w:ascii="Times New Roman" w:hAnsi="Times New Roman" w:cs="Times New Roman"/>
-        </w:rPr>
-        <w:t>acted and included in the alert.</w:t>
+        <w:t xml:space="preserve"> For each flagged flow, feature attributions are computed by accumulating gradients along a path from a zero-valued baseline to the actual input (Eq. 6). The top-5 contributing features are extracted and included in the alert.</w:t>
       </w:r>
     </w:p>
     <w:p>
@@ -7638,13 +7059,7 @@
         <w:rPr>
           <w:rFonts w:ascii="Times New Roman" w:hAnsi="Times New Roman" w:cs="Times New Roman"/>
         </w:rPr>
-        <w:t xml:space="preserve"> The learned attention coefficients from the final GAT layer identify whi</w:t>
-      </w:r>
-      <w:r>
-        <w:rPr>
-          <w:rFonts w:ascii="Times New Roman" w:hAnsi="Times New Roman" w:cs="Times New Roman"/>
-        </w:rPr>
-        <w:t>ch neighbouring flows in the graph most influenced the classification. This provides structural context.</w:t>
+        <w:t xml:space="preserve"> The learned attention coefficients from the final GAT layer identify which neighbouring flows in the graph most influenced the classification. This provides structural context.</w:t>
       </w:r>
     </w:p>
     <w:p>
@@ -7658,13 +7073,14 @@
         <w:rPr>
           <w:rFonts w:ascii="Times New Roman" w:hAnsi="Times New Roman" w:cs="Times New Roman"/>
         </w:rPr>
-        <w:t>Alerts are formatted in ECS (Elastic Common Schema) JSON format. I serve them through a FastAPI endpoint (POST /score). Each alert includes: timestamp,</w:t>
-      </w:r>
-      <w:r>
-        <w:rPr>
-          <w:rFonts w:ascii="Times New Roman" w:hAnsi="Times New Roman" w:cs="Times New Roman"/>
-        </w:rPr>
-        <w:t xml:space="preserve"> severity level, confidence score, predicted label, top contributing features, and top neighbour flows. This format works with SIEM platforms like Elastic Security and Splunk.</w:t>
+        <w:t xml:space="preserve">Alerts are formatted in ECS (Elastic Common Schema) JSON format. I serve them through a FastAPI endpoint (POST /score). Each alert includes: timestamp, severity level, confidence score, </w:t>
+      </w:r>
+      <w:r>
+        <w:rPr>
+          <w:rFonts w:ascii="Times New Roman" w:hAnsi="Times New Roman" w:cs="Times New Roman"/>
+        </w:rPr>
+        <w:lastRenderedPageBreak/>
+        <w:t>predicted label, top contributing features, and top neighbour flows. This format works with SIEM platforms like Elastic Security and Splunk.</w:t>
       </w:r>
     </w:p>
     <w:p>
@@ -7678,26 +7094,7 @@
         <w:rPr>
           <w:rFonts w:ascii="Times New Roman" w:hAnsi="Times New Roman" w:cs="Times New Roman"/>
         </w:rPr>
-        <w:t xml:space="preserve">The full research pipeline from raw data to SIEM alerts is shown earlier in </w:t>
-      </w:r>
-      <w:r>
-        <w:rPr>
-          <w:rFonts w:ascii="Times New Roman" w:hAnsi="Times New Roman" w:cs="Times New Roman"/>
-        </w:rPr>
-        <w:t xml:space="preserve">Figure 7 and is used here as the implementation reference for this section. During implementation, I found that running Integrated Gradients on graph sequences was slower than expected because Captum </w:t>
-      </w:r>
-      <w:r>
-        <w:rPr>
-          <w:rFonts w:ascii="Times New Roman" w:hAnsi="Times New Roman" w:cs="Times New Roman"/>
-        </w:rPr>
-        <w:lastRenderedPageBreak/>
-        <w:t>needs many forward passes (50 integration steps by defau</w:t>
-      </w:r>
-      <w:r>
-        <w:rPr>
-          <w:rFonts w:ascii="Times New Roman" w:hAnsi="Times New Roman" w:cs="Times New Roman"/>
-        </w:rPr>
-        <w:t>lt). To keep inference time acceptable on CPU, I set the system to compute explanations only for flows flagged as attacks, rather than for every single flow. This reduced the explainability overhead without losing the most important alerts.</w:t>
+        <w:t>The full research pipeline from raw data to SIEM alerts is shown earlier in Figure 7 and is used here as the implementation reference for this section. During implementation, I found that running Integrated Gradients on graph sequences was slower than expected because Captum needs many forward passes (50 integration steps by default). To keep inference time acceptable on CPU, I set the system to compute explanations only for flows flagged as attacks, rather than for every single flow. This reduced the explainability overhead without losing the most important alerts.</w:t>
       </w:r>
     </w:p>
     <w:p>
@@ -7713,13 +7110,7 @@
         <w:rPr>
           <w:rFonts w:ascii="Times New Roman" w:hAnsi="Times New Roman" w:cs="Times New Roman"/>
         </w:rPr>
-        <w:t>2.8 Academic Wo</w:t>
-      </w:r>
-      <w:r>
-        <w:rPr>
-          <w:rFonts w:ascii="Times New Roman" w:hAnsi="Times New Roman" w:cs="Times New Roman"/>
-        </w:rPr>
-        <w:t>rth and Verifiable Goal</w:t>
+        <w:t>2.8 Academic Worth and Verifiable Goal</w:t>
       </w:r>
       <w:bookmarkEnd w:id="20"/>
     </w:p>
@@ -7734,13 +7125,7 @@
         <w:rPr>
           <w:rFonts w:ascii="Times New Roman" w:hAnsi="Times New Roman" w:cs="Times New Roman"/>
         </w:rPr>
-        <w:t>My project has a clear, verifiable academic goal: to test whether an explainable dynamic GNN, trained with federated learning, can detect IoT attacks and produce useful SIEM alerts on CPU-based edge devices. I will demonstrate the r</w:t>
-      </w:r>
-      <w:r>
-        <w:rPr>
-          <w:rFonts w:ascii="Times New Roman" w:hAnsi="Times New Roman" w:cs="Times New Roman"/>
-        </w:rPr>
-        <w:t>igour of my research in the following ways:</w:t>
+        <w:t>My project has a clear, verifiable academic goal: to test whether an explainable dynamic GNN, trained with federated learning, can detect IoT attacks and produce useful SIEM alerts on CPU-based edge devices. I will demonstrate the rigour of my research in the following ways:</w:t>
       </w:r>
     </w:p>
     <w:p>
@@ -7812,59 +7197,34 @@
           <w:rFonts w:ascii="Times New Roman" w:hAnsi="Times New Roman" w:cs="Times New Roman"/>
           <w:b/>
         </w:rPr>
-        <w:t>Practical applicab</w:t>
-      </w:r>
+        <w:t>Practical applicability:</w:t>
+      </w:r>
+      <w:r>
+        <w:rPr>
+          <w:rFonts w:ascii="Times New Roman" w:hAnsi="Times New Roman" w:cs="Times New Roman"/>
+        </w:rPr>
+        <w:t xml:space="preserve"> The full pipeline runs on CPU with acceptable latency for edge use. This bridges the gap between academic research and real SOC tools.</w:t>
+      </w:r>
+    </w:p>
+    <w:p>
+      <w:pPr>
+        <w:jc w:val="both"/>
+        <w:rPr>
+          <w:rFonts w:ascii="Times New Roman" w:hAnsi="Times New Roman" w:cs="Times New Roman"/>
+        </w:rPr>
+      </w:pPr>
       <w:r>
         <w:rPr>
           <w:rFonts w:ascii="Times New Roman" w:hAnsi="Times New Roman" w:cs="Times New Roman"/>
           <w:b/>
         </w:rPr>
-        <w:t>ility:</w:t>
-      </w:r>
-      <w:r>
-        <w:rPr>
-          <w:rFonts w:ascii="Times New Roman" w:hAnsi="Times New Roman" w:cs="Times New Roman"/>
-        </w:rPr>
-        <w:t xml:space="preserve"> The full pipeline runs on CPU with acceptable latency for edge use. This bridges the gap between academic research and real SOC tools.</w:t>
-      </w:r>
-    </w:p>
-    <w:p>
-      <w:pPr>
-        <w:jc w:val="both"/>
-        <w:rPr>
-          <w:rFonts w:ascii="Times New Roman" w:hAnsi="Times New Roman" w:cs="Times New Roman"/>
-        </w:rPr>
-      </w:pPr>
-      <w:r>
-        <w:rPr>
-          <w:rFonts w:ascii="Times New Roman" w:hAnsi="Times New Roman" w:cs="Times New Roman"/>
-          <w:b/>
-        </w:rPr>
         <w:t>How I will present the data to prove rigour:</w:t>
       </w:r>
       <w:r>
         <w:rPr>
           <w:rFonts w:ascii="Times New Roman" w:hAnsi="Times New Roman" w:cs="Times New Roman"/>
         </w:rPr>
-        <w:t xml:space="preserve"> I will present results in comparison tables, confusion matrices, ROC </w:t>
-      </w:r>
-      <w:r>
-        <w:rPr>
-          <w:rFonts w:ascii="Times New Roman" w:hAnsi="Times New Roman" w:cs="Times New Roman"/>
-        </w:rPr>
-        <w:t>curves, and federated learning convergence plots. Each hypothesis (H1 to H3) maps to specific metrics that can be checked on the held-out test set. I will not use the test set for any tuning. It is reserved solely for final evaluation. Beyond the performan</w:t>
-      </w:r>
-      <w:r>
-        <w:rPr>
-          <w:rFonts w:ascii="Times New Roman" w:hAnsi="Times New Roman" w:cs="Times New Roman"/>
-        </w:rPr>
-        <w:t xml:space="preserve">ce numbers, I believe the project is useful because it shows that all four components (graph detection, federated training, explainability, and SIEM output) can work together in one small system on a normal computer. Most papers only look at one or two of </w:t>
-      </w:r>
-      <w:r>
-        <w:rPr>
-          <w:rFonts w:ascii="Times New Roman" w:hAnsi="Times New Roman" w:cs="Times New Roman"/>
-        </w:rPr>
-        <w:t>these parts. Showing that they can be combined in a working prototype is valuable for both researchers and for SOC teams who want to try graph-based detection without needing expensive hardware.</w:t>
+        <w:t xml:space="preserve"> I will present results in comparison tables, confusion matrices, ROC curves, and federated learning convergence plots. Each hypothesis (H1 to H3) maps to specific metrics that can be checked on the held-out test set. I will not use the test set for any tuning. It is reserved solely for final evaluation. Beyond the performance numbers, I believe the project is useful because it shows that all four components (graph detection, federated training, explainability, and SIEM output) can work together in one small system on a normal computer. Most papers only look at one or two of these parts. Showing that they can be combined in a working prototype is valuable for both researchers and for SOC teams who want to try graph-based detection without needing expensive hardware.</w:t>
       </w:r>
     </w:p>
     <w:p>
@@ -7880,6 +7240,7 @@
         <w:rPr>
           <w:rFonts w:ascii="Times New Roman" w:hAnsi="Times New Roman" w:cs="Times New Roman"/>
         </w:rPr>
+        <w:lastRenderedPageBreak/>
         <w:t>2.9 Anticipated Critical Reflection</w:t>
       </w:r>
       <w:bookmarkEnd w:id="21"/>
@@ -7895,13 +7256,7 @@
         <w:rPr>
           <w:rFonts w:ascii="Times New Roman" w:hAnsi="Times New Roman" w:cs="Times New Roman"/>
         </w:rPr>
-        <w:t xml:space="preserve">The MSc Project Handbook </w:t>
-      </w:r>
-      <w:r>
-        <w:rPr>
-          <w:rFonts w:ascii="Times New Roman" w:hAnsi="Times New Roman" w:cs="Times New Roman"/>
-        </w:rPr>
-        <w:t>requires a Critical Reflection section in the final report. At this stage, I anticipate reflecting on the following areas:</w:t>
+        <w:t>The MSc Project Handbook requires a Critical Reflection section in the final report. At this stage, I anticipate reflecting on the following areas:</w:t>
       </w:r>
     </w:p>
     <w:p>
@@ -7923,13 +7278,7 @@
         <w:rPr>
           <w:rFonts w:ascii="Times New Roman" w:hAnsi="Times New Roman" w:cs="Times New Roman"/>
         </w:rPr>
-        <w:t xml:space="preserve"> CICIoT2023 is a controlled testbed dataset. Results may not directly transfer to all real IoT environment</w:t>
-      </w:r>
-      <w:r>
-        <w:rPr>
-          <w:rFonts w:ascii="Times New Roman" w:hAnsi="Times New Roman" w:cs="Times New Roman"/>
-        </w:rPr>
-        <w:t>s with different devices and traffic patterns.</w:t>
+        <w:t xml:space="preserve"> CICIoT2023 is a controlled testbed dataset. Results may not directly transfer to all real IoT environments with different devices and traffic patterns.</w:t>
       </w:r>
     </w:p>
     <w:p>
@@ -7945,20 +7294,13 @@
           <w:rFonts w:ascii="Times New Roman" w:hAnsi="Times New Roman" w:cs="Times New Roman"/>
           <w:b/>
         </w:rPr>
-        <w:lastRenderedPageBreak/>
         <w:t>Graph construction validity:</w:t>
       </w:r>
       <w:r>
         <w:rPr>
           <w:rFonts w:ascii="Times New Roman" w:hAnsi="Times New Roman" w:cs="Times New Roman"/>
         </w:rPr>
-        <w:t xml:space="preserve"> kNN feature-similarity graphs are a proxy for true network topology. The assumption that flows similar in feature space are behaviourally related may not always hold, especially fo</w:t>
-      </w:r>
-      <w:r>
-        <w:rPr>
-          <w:rFonts w:ascii="Times New Roman" w:hAnsi="Times New Roman" w:cs="Times New Roman"/>
-        </w:rPr>
-        <w:t>r encrypted traffic.</w:t>
+        <w:t xml:space="preserve"> kNN feature-similarity graphs are a proxy for true network topology. The assumption that flows similar in feature space are behaviourally related may not always hold, especially for encrypted traffic.</w:t>
       </w:r>
     </w:p>
     <w:p>
@@ -8002,13 +7344,7 @@
         <w:rPr>
           <w:rFonts w:ascii="Times New Roman" w:hAnsi="Times New Roman" w:cs="Times New Roman"/>
         </w:rPr>
-        <w:t xml:space="preserve"> The flow features are consistent with SDN</w:t>
-      </w:r>
-      <w:r>
-        <w:rPr>
-          <w:rFonts w:ascii="Times New Roman" w:hAnsi="Times New Roman" w:cs="Times New Roman"/>
-        </w:rPr>
-        <w:t xml:space="preserve"> controller exports. However, the prototype does not integrate with an actual SDN controller. The SDIoT framing provides architectural context rather than a demonstrated deployment.</w:t>
+        <w:t xml:space="preserve"> The flow features are consistent with SDN controller exports. However, the prototype does not integrate with an actual SDN controller. The SDIoT framing provides architectural context rather than a demonstrated deployment.</w:t>
       </w:r>
     </w:p>
     <w:p>
@@ -8030,13 +7366,7 @@
         <w:rPr>
           <w:rFonts w:ascii="Times New Roman" w:hAnsi="Times New Roman" w:cs="Times New Roman"/>
         </w:rPr>
-        <w:t xml:space="preserve"> Without a formal user study with SOC analysts, </w:t>
-      </w:r>
-      <w:r>
-        <w:rPr>
-          <w:rFonts w:ascii="Times New Roman" w:hAnsi="Times New Roman" w:cs="Times New Roman"/>
-        </w:rPr>
-        <w:t>the claim that explanations "support" triage is based on qualitative assessment rather than measured analyst performance improvement.</w:t>
+        <w:t xml:space="preserve"> Without a formal user study with SOC analysts, the claim that explanations "support" triage is based on qualitative assessment rather than measured analyst performance improvement.</w:t>
       </w:r>
     </w:p>
     <w:p>
@@ -8072,25 +7402,7 @@
         <w:rPr>
           <w:rFonts w:ascii="Times New Roman" w:hAnsi="Times New Roman" w:cs="Times New Roman"/>
         </w:rPr>
-        <w:t>These limitations will define clear b</w:t>
-      </w:r>
-      <w:r>
-        <w:rPr>
-          <w:rFonts w:ascii="Times New Roman" w:hAnsi="Times New Roman" w:cs="Times New Roman"/>
-        </w:rPr>
-        <w:t>oundaries for my conclusions and identify directions for future work. I will incorporate feedback from this interim report into the critical reflection section of my final report. If I were to restart this project, I would spend more time early on explorin</w:t>
-      </w:r>
-      <w:r>
-        <w:rPr>
-          <w:rFonts w:ascii="Times New Roman" w:hAnsi="Times New Roman" w:cs="Times New Roman"/>
-        </w:rPr>
-        <w:t>g the dataset before jumping into graph construction. I spent several days debugging the kNN graph builder before I realised that some features had very different scales, which made the distance calculations unreliable until I applied proper normalisation.</w:t>
-      </w:r>
-      <w:r>
-        <w:rPr>
-          <w:rFonts w:ascii="Times New Roman" w:hAnsi="Times New Roman" w:cs="Times New Roman"/>
-        </w:rPr>
-        <w:t xml:space="preserve"> Starting with a thorough data exploration step would have saved that time.</w:t>
+        <w:t>These limitations will define clear boundaries for my conclusions and identify directions for future work. I will incorporate feedback from this interim report into the critical reflection section of my final report. If I were to restart this project, I would spend more time early on exploring the dataset before jumping into graph construction. I spent several days debugging the kNN graph builder before I realised that some features had very different scales, which made the distance calculations unreliable until I applied proper normalisation. Starting with a thorough data exploration step would have saved that time.</w:t>
       </w:r>
     </w:p>
     <w:p>
@@ -8121,13 +7433,7 @@
         <w:rPr>
           <w:rFonts w:ascii="Times New Roman" w:hAnsi="Times New Roman" w:cs="Times New Roman"/>
         </w:rPr>
-        <w:t>In this part, I explain what I have done so far and what still needs to be done before submission. It also covers what I will do if results are not as expect</w:t>
-      </w:r>
-      <w:r>
-        <w:rPr>
-          <w:rFonts w:ascii="Times New Roman" w:hAnsi="Times New Roman" w:cs="Times New Roman"/>
-        </w:rPr>
-        <w:t>ed.</w:t>
+        <w:t>In this part, I explain what I have done so far and what still needs to be done before submission. It also covers what I will do if results are not as expected.</w:t>
       </w:r>
     </w:p>
     <w:p>
@@ -8174,19 +7480,14 @@
           <w:rFonts w:ascii="Times New Roman" w:hAnsi="Times New Roman" w:cs="Times New Roman"/>
           <w:b/>
         </w:rPr>
+        <w:lastRenderedPageBreak/>
         <w:t>Data pipeline:</w:t>
       </w:r>
       <w:r>
         <w:rPr>
           <w:rFonts w:ascii="Times New Roman" w:hAnsi="Times New Roman" w:cs="Times New Roman"/>
         </w:rPr>
-        <w:t xml:space="preserve"> CICIoT2023 has been downloaded, preprocessed, normalised, and exported as Parquet files. The fitted scaler has been saved for consistent transformatio</w:t>
-      </w:r>
-      <w:r>
-        <w:rPr>
-          <w:rFonts w:ascii="Times New Roman" w:hAnsi="Times New Roman" w:cs="Times New Roman"/>
-        </w:rPr>
-        <w:t>n of validation and test sets.</w:t>
+        <w:t xml:space="preserve"> CICIoT2023 has been downloaded, preprocessed, normalised, and exported as Parquet files. The fitted scaler has been saved for consistent transformation of validation and test sets.</w:t>
       </w:r>
     </w:p>
     <w:p>
@@ -8230,13 +7531,7 @@
         <w:rPr>
           <w:rFonts w:ascii="Times New Roman" w:hAnsi="Times New Roman" w:cs="Times New Roman"/>
         </w:rPr>
-        <w:t xml:space="preserve"> Random Forest, MLP, centralised GNN, and federated GNN architectures have been implement</w:t>
-      </w:r>
-      <w:r>
-        <w:rPr>
-          <w:rFonts w:ascii="Times New Roman" w:hAnsi="Times New Roman" w:cs="Times New Roman"/>
-        </w:rPr>
-        <w:t>ed and trained.</w:t>
+        <w:t xml:space="preserve"> Random Forest, MLP, centralised GNN, and federated GNN architectures have been implemented and trained.</w:t>
       </w:r>
     </w:p>
     <w:p>
@@ -8252,7 +7547,6 @@
           <w:rFonts w:ascii="Times New Roman" w:hAnsi="Times New Roman" w:cs="Times New Roman"/>
           <w:b/>
         </w:rPr>
-        <w:lastRenderedPageBreak/>
         <w:t>Training infrastructure:</w:t>
       </w:r>
       <w:r>
@@ -8281,13 +7575,7 @@
         <w:rPr>
           <w:rFonts w:ascii="Times New Roman" w:hAnsi="Times New Roman" w:cs="Times New Roman"/>
         </w:rPr>
-        <w:t xml:space="preserve"> Flower server and client scripts are implemented. Dirichlet non-IID splitting is functional. A 10-roun</w:t>
-      </w:r>
-      <w:r>
-        <w:rPr>
-          <w:rFonts w:ascii="Times New Roman" w:hAnsi="Times New Roman" w:cs="Times New Roman"/>
-        </w:rPr>
-        <w:t>d simulation has been completed.</w:t>
+        <w:t xml:space="preserve"> Flower server and client scripts are implemented. Dirichlet non-IID splitting is functional. A 10-round simulation has been completed.</w:t>
       </w:r>
     </w:p>
     <w:p>
@@ -8347,14 +7635,7 @@
           <w:rFonts w:ascii="Times New Roman" w:hAnsi="Times New Roman" w:cs="Times New Roman"/>
           <w:b/>
         </w:rPr>
-        <w:t>Prelimina</w:t>
-      </w:r>
-      <w:r>
-        <w:rPr>
-          <w:rFonts w:ascii="Times New Roman" w:hAnsi="Times New Roman" w:cs="Times New Roman"/>
-          <w:b/>
-        </w:rPr>
-        <w:t>ry metrics:</w:t>
+        <w:t>Preliminary metrics:</w:t>
       </w:r>
       <w:r>
         <w:rPr>
@@ -8390,13 +7671,7 @@
         <w:rPr>
           <w:rFonts w:ascii="Times New Roman" w:hAnsi="Times New Roman" w:cs="Times New Roman"/>
         </w:rPr>
-        <w:t>3.2</w:t>
-      </w:r>
-      <w:r>
-        <w:rPr>
-          <w:rFonts w:ascii="Times New Roman" w:hAnsi="Times New Roman" w:cs="Times New Roman"/>
-        </w:rPr>
-        <w:t xml:space="preserve"> Plan to Completion</w:t>
+        <w:t>3.2 Plan to Completion</w:t>
       </w:r>
       <w:bookmarkEnd w:id="24"/>
     </w:p>
@@ -8743,14 +8018,7 @@
                 <w:rFonts w:ascii="Times New Roman" w:hAnsi="Times New Roman" w:cs="Times New Roman"/>
                 <w:sz w:val="20"/>
               </w:rPr>
-              <w:t>Generate all</w:t>
-            </w:r>
-            <w:r>
-              <w:rPr>
-                <w:rFonts w:ascii="Times New Roman" w:hAnsi="Times New Roman" w:cs="Times New Roman"/>
-                <w:sz w:val="20"/>
-              </w:rPr>
-              <w:t xml:space="preserve"> figures: confusion matrices, ROC curves, FL convergence plot, inference time chart</w:t>
+              <w:t>Generate all figures: confusion matrices, ROC curves, FL convergence plot, inference time chart</w:t>
             </w:r>
           </w:p>
         </w:tc>
@@ -8863,7 +8131,15 @@
                 <w:rFonts w:ascii="Times New Roman" w:hAnsi="Times New Roman" w:cs="Times New Roman"/>
                 <w:sz w:val="20"/>
               </w:rPr>
-              <w:t>Conduct sensitivity analysis: vary k (3, 5, 7) and window_size (25, 50, 100) if time permits</w:t>
+              <w:t xml:space="preserve">Conduct sensitivity </w:t>
+            </w:r>
+            <w:r>
+              <w:rPr>
+                <w:rFonts w:ascii="Times New Roman" w:hAnsi="Times New Roman" w:cs="Times New Roman"/>
+                <w:sz w:val="20"/>
+              </w:rPr>
+              <w:lastRenderedPageBreak/>
+              <w:t>analysis: vary k (3, 5, 7) and window_size (25, 50, 100) if time permits</w:t>
             </w:r>
           </w:p>
         </w:tc>
@@ -8890,7 +8166,16 @@
                 <w:rFonts w:ascii="Times New Roman" w:hAnsi="Times New Roman" w:cs="Times New Roman"/>
                 <w:sz w:val="20"/>
               </w:rPr>
-              <w:t>Sensitivity analysis table (optional)</w:t>
+              <w:lastRenderedPageBreak/>
+              <w:t xml:space="preserve">Sensitivity analysis </w:t>
+            </w:r>
+            <w:r>
+              <w:rPr>
+                <w:rFonts w:ascii="Times New Roman" w:hAnsi="Times New Roman" w:cs="Times New Roman"/>
+                <w:sz w:val="20"/>
+              </w:rPr>
+              <w:lastRenderedPageBreak/>
+              <w:t>table (optional)</w:t>
             </w:r>
           </w:p>
         </w:tc>
@@ -8922,6 +8207,7 @@
                 <w:rFonts w:ascii="Times New Roman" w:hAnsi="Times New Roman" w:cs="Times New Roman"/>
                 <w:sz w:val="20"/>
               </w:rPr>
+              <w:lastRenderedPageBreak/>
               <w:t>6–7</w:t>
             </w:r>
           </w:p>
@@ -9035,7 +8321,6 @@
                 <w:rFonts w:ascii="Times New Roman" w:hAnsi="Times New Roman" w:cs="Times New Roman"/>
                 <w:sz w:val="20"/>
               </w:rPr>
-              <w:lastRenderedPageBreak/>
               <w:t>7</w:t>
             </w:r>
           </w:p>
@@ -9203,14 +8488,7 @@
                 <w:rFonts w:ascii="Times New Roman" w:hAnsi="Times New Roman" w:cs="Times New Roman"/>
                 <w:sz w:val="20"/>
               </w:rPr>
-              <w:t xml:space="preserve">Incorporate interim </w:t>
-            </w:r>
-            <w:r>
-              <w:rPr>
-                <w:rFonts w:ascii="Times New Roman" w:hAnsi="Times New Roman" w:cs="Times New Roman"/>
-                <w:sz w:val="20"/>
-              </w:rPr>
-              <w:t>report feedback; integrate all chapters; proofread</w:t>
+              <w:t>Incorporate interim report feedback; integrate all chapters; proofread</w:t>
             </w:r>
           </w:p>
         </w:tc>
@@ -9367,13 +8645,7 @@
         <w:rPr>
           <w:rFonts w:ascii="Times New Roman" w:hAnsi="Times New Roman" w:cs="Times New Roman"/>
         </w:rPr>
-        <w:t>Figure 8 provides a visual roadmap of the remaining project phases fr</w:t>
-      </w:r>
-      <w:r>
-        <w:rPr>
-          <w:rFonts w:ascii="Times New Roman" w:hAnsi="Times New Roman" w:cs="Times New Roman"/>
-        </w:rPr>
-        <w:t>om interim submission to final submission.</w:t>
+        <w:t>Figure 8 provides a visual roadmap of the remaining project phases from interim submission to final submission.</w:t>
       </w:r>
     </w:p>
     <w:p>
@@ -9485,14 +8757,8 @@
           <w:rFonts w:ascii="Times New Roman" w:hAnsi="Times New Roman" w:cs="Times New Roman"/>
           <w:b/>
         </w:rPr>
-        <w:t xml:space="preserve">Table 4: Alignment of Project </w:t>
-      </w:r>
-      <w:r>
-        <w:rPr>
-          <w:rFonts w:ascii="Times New Roman" w:hAnsi="Times New Roman" w:cs="Times New Roman"/>
-          <w:b/>
-        </w:rPr>
-        <w:t>Progress with Final Dissertation Criteria</w:t>
+        <w:lastRenderedPageBreak/>
+        <w:t>Table 4: Alignment of Project Progress with Final Dissertation Criteria</w:t>
       </w:r>
     </w:p>
     <w:tbl>
@@ -9769,15 +9035,7 @@
                 <w:rFonts w:ascii="Times New Roman" w:hAnsi="Times New Roman" w:cs="Times New Roman"/>
                 <w:sz w:val="20"/>
               </w:rPr>
-              <w:lastRenderedPageBreak/>
-              <w:t xml:space="preserve">Context / </w:t>
-            </w:r>
-            <w:r>
-              <w:rPr>
-                <w:rFonts w:ascii="Times New Roman" w:hAnsi="Times New Roman" w:cs="Times New Roman"/>
-                <w:sz w:val="20"/>
-              </w:rPr>
-              <w:t>Literature Review</w:t>
+              <w:t>Context / Literature Review</w:t>
             </w:r>
           </w:p>
         </w:tc>
@@ -9971,14 +9229,7 @@
                 <w:rFonts w:ascii="Times New Roman" w:hAnsi="Times New Roman" w:cs="Times New Roman"/>
                 <w:sz w:val="20"/>
               </w:rPr>
-              <w:t>Add final validation detail</w:t>
-            </w:r>
-            <w:r>
-              <w:rPr>
-                <w:rFonts w:ascii="Times New Roman" w:hAnsi="Times New Roman" w:cs="Times New Roman"/>
-                <w:sz w:val="20"/>
-              </w:rPr>
-              <w:t>s and any sensitivity outcomes</w:t>
+              <w:t>Add final validation details and any sensitivity outcomes</w:t>
             </w:r>
           </w:p>
         </w:tc>
@@ -10204,14 +9455,7 @@
                 <w:rFonts w:ascii="Times New Roman" w:hAnsi="Times New Roman" w:cs="Times New Roman"/>
                 <w:sz w:val="20"/>
               </w:rPr>
-              <w:t xml:space="preserve">Run final fixed-seed </w:t>
-            </w:r>
-            <w:r>
-              <w:rPr>
-                <w:rFonts w:ascii="Times New Roman" w:hAnsi="Times New Roman" w:cs="Times New Roman"/>
-                <w:sz w:val="20"/>
-              </w:rPr>
-              <w:t>experiments and verify consistency</w:t>
+              <w:t>Run final fixed-seed experiments and verify consistency</w:t>
             </w:r>
           </w:p>
         </w:tc>
@@ -10437,14 +9681,7 @@
                 <w:rFonts w:ascii="Times New Roman" w:hAnsi="Times New Roman" w:cs="Times New Roman"/>
                 <w:sz w:val="20"/>
               </w:rPr>
-              <w:t xml:space="preserve">Finalise </w:t>
-            </w:r>
-            <w:r>
-              <w:rPr>
-                <w:rFonts w:ascii="Times New Roman" w:hAnsi="Times New Roman" w:cs="Times New Roman"/>
-                <w:sz w:val="20"/>
-              </w:rPr>
-              <w:t>evidence-based recommendations from results</w:t>
+              <w:t>Finalise evidence-based recommendations from results</w:t>
             </w:r>
           </w:p>
         </w:tc>
@@ -10591,13 +9828,7 @@
         <w:rPr>
           <w:rFonts w:ascii="Times New Roman" w:hAnsi="Times New Roman" w:cs="Times New Roman"/>
         </w:rPr>
-        <w:t xml:space="preserve">When the final results are ready, I will analyse them </w:t>
-      </w:r>
-      <w:r>
-        <w:rPr>
-          <w:rFonts w:ascii="Times New Roman" w:hAnsi="Times New Roman" w:cs="Times New Roman"/>
-        </w:rPr>
-        <w:t>as follows:</w:t>
+        <w:t>When the final results are ready, I will analyse them as follows:</w:t>
       </w:r>
     </w:p>
     <w:p>
@@ -10617,6 +9848,7 @@
           <w:rFonts w:ascii="Times New Roman" w:hAnsi="Times New Roman" w:cs="Times New Roman"/>
           <w:b/>
         </w:rPr>
+        <w:lastRenderedPageBreak/>
         <w:t>Model comparison (H1):</w:t>
       </w:r>
       <w:r>
@@ -10643,14 +9875,7 @@
           <w:rFonts w:ascii="Times New Roman" w:hAnsi="Times New Roman" w:cs="Times New Roman"/>
           <w:b/>
         </w:rPr>
-        <w:t>Federated vs. central</w:t>
-      </w:r>
-      <w:r>
-        <w:rPr>
-          <w:rFonts w:ascii="Times New Roman" w:hAnsi="Times New Roman" w:cs="Times New Roman"/>
-          <w:b/>
-        </w:rPr>
-        <w:t>ised (H2):</w:t>
+        <w:t>Federated vs. centralised (H2):</w:t>
       </w:r>
       <w:r>
         <w:rPr>
@@ -10676,20 +9901,13 @@
           <w:rFonts w:ascii="Times New Roman" w:hAnsi="Times New Roman" w:cs="Times New Roman"/>
           <w:b/>
         </w:rPr>
-        <w:lastRenderedPageBreak/>
         <w:t>Explainability assessment (H3):</w:t>
       </w:r>
       <w:r>
         <w:rPr>
           <w:rFonts w:ascii="Times New Roman" w:hAnsi="Times New Roman" w:cs="Times New Roman"/>
         </w:rPr>
-        <w:t xml:space="preserve"> I will generate 3 to 5 example ale</w:t>
-      </w:r>
-      <w:r>
-        <w:rPr>
-          <w:rFonts w:ascii="Times New Roman" w:hAnsi="Times New Roman" w:cs="Times New Roman"/>
-        </w:rPr>
-        <w:t>rts with full explanations (top features and top flows). I will discuss whether the highlighted features would help a SOC analyst understand and act on each alert. This assessment is qualitative.</w:t>
+        <w:t xml:space="preserve"> I will generate 3 to 5 example alerts with full explanations (top features and top flows). I will discuss whether the highlighted features would help a SOC analyst understand and act on each alert. This assessment is qualitative.</w:t>
       </w:r>
     </w:p>
     <w:p>
@@ -10729,19 +9947,7 @@
         <w:rPr>
           <w:rFonts w:ascii="Times New Roman" w:hAnsi="Times New Roman" w:cs="Times New Roman"/>
         </w:rPr>
-        <w:t xml:space="preserve">One thing I noticed in the preliminary runs is that the centralised GNN reached very high validation </w:t>
-      </w:r>
-      <w:r>
-        <w:rPr>
-          <w:rFonts w:ascii="Times New Roman" w:hAnsi="Times New Roman" w:cs="Times New Roman"/>
-        </w:rPr>
-        <w:t>scores after just one or two epochs. This fast convergence might mean the chosen subset is relatively easy for the model, or it might mean the class-weighted loss and stratified windowing are working very well together. I plan to look into this more carefu</w:t>
-      </w:r>
-      <w:r>
-        <w:rPr>
-          <w:rFonts w:ascii="Times New Roman" w:hAnsi="Times New Roman" w:cs="Times New Roman"/>
-        </w:rPr>
-        <w:t>lly during the final evaluation. If the task is too easy, I may try a harder subset or discuss it as a limitation.</w:t>
+        <w:t>One thing I noticed in the preliminary runs is that the centralised GNN reached very high validation scores after just one or two epochs. This fast convergence might mean the chosen subset is relatively easy for the model, or it might mean the class-weighted loss and stratified windowing are working very well together. I plan to look into this more carefully during the final evaluation. If the task is too easy, I may try a harder subset or discuss it as a limitation.</w:t>
       </w:r>
     </w:p>
     <w:p>
@@ -10794,13 +10000,7 @@
         <w:rPr>
           <w:rFonts w:ascii="Times New Roman" w:hAnsi="Times New Roman" w:cs="Times New Roman"/>
         </w:rPr>
-        <w:t xml:space="preserve"> That is</w:t>
-      </w:r>
-      <w:r>
-        <w:rPr>
-          <w:rFonts w:ascii="Times New Roman" w:hAnsi="Times New Roman" w:cs="Times New Roman"/>
-        </w:rPr>
-        <w:t xml:space="preserve"> still a valid result. I will discuss why flat models might be sufficient for this dataset. The contribution then becomes evidence about when graphs help and when they do not.</w:t>
+        <w:t xml:space="preserve"> That is still a valid result. I will discuss why flat models might be sufficient for this dataset. The contribution then becomes evidence about when graphs help and when they do not.</w:t>
       </w:r>
     </w:p>
     <w:p>
@@ -10822,13 +10022,7 @@
         <w:rPr>
           <w:rFonts w:ascii="Times New Roman" w:hAnsi="Times New Roman" w:cs="Times New Roman"/>
         </w:rPr>
-        <w:t xml:space="preserve"> I will investigate whet</w:t>
-      </w:r>
-      <w:r>
-        <w:rPr>
-          <w:rFonts w:ascii="Times New Roman" w:hAnsi="Times New Roman" w:cs="Times New Roman"/>
-        </w:rPr>
-        <w:t>her the drop is caused by non-IID data or too few rounds. I may suggest alternatives like FedProx or more communication rounds for future work.</w:t>
+        <w:t xml:space="preserve"> I will investigate whether the drop is caused by non-IID data or too few rounds. I may suggest alternatives like FedProx or more communication rounds for future work.</w:t>
       </w:r>
     </w:p>
     <w:p>
@@ -10850,13 +10044,7 @@
         <w:rPr>
           <w:rFonts w:ascii="Times New Roman" w:hAnsi="Times New Roman" w:cs="Times New Roman"/>
         </w:rPr>
-        <w:t xml:space="preserve"> I will apply it only to selected alerts (for example, the top 10% by con</w:t>
-      </w:r>
-      <w:r>
-        <w:rPr>
-          <w:rFonts w:ascii="Times New Roman" w:hAnsi="Times New Roman" w:cs="Times New Roman"/>
-        </w:rPr>
-        <w:t>fidence). I will document the trade-off and may suggest faster methods.</w:t>
+        <w:t xml:space="preserve"> I will apply it only to selected alerts (for example, the top 10% by confidence). I will document the trade-off and may suggest faster methods.</w:t>
       </w:r>
     </w:p>
     <w:p>
@@ -10914,13 +10102,7 @@
           <w:rFonts w:ascii="Times New Roman" w:hAnsi="Times New Roman" w:cs="Times New Roman"/>
         </w:rPr>
         <w:lastRenderedPageBreak/>
-        <w:t>Refere</w:t>
-      </w:r>
-      <w:r>
-        <w:rPr>
-          <w:rFonts w:ascii="Times New Roman" w:hAnsi="Times New Roman" w:cs="Times New Roman"/>
-        </w:rPr>
-        <w:t>nces</w:t>
+        <w:t>References</w:t>
       </w:r>
       <w:bookmarkEnd w:id="28"/>
     </w:p>
@@ -10948,13 +10130,7 @@
         <w:rPr>
           <w:rFonts w:ascii="Times New Roman" w:hAnsi="Times New Roman" w:cs="Times New Roman"/>
         </w:rPr>
-        <w:t>, 32(1), e</w:t>
-      </w:r>
-      <w:r>
-        <w:rPr>
-          <w:rFonts w:ascii="Times New Roman" w:hAnsi="Times New Roman" w:cs="Times New Roman"/>
-        </w:rPr>
-        <w:t>4150. doi: 10.1002/ett.4150.</w:t>
+        <w:t>, 32(1), e4150. doi: 10.1002/ett.4150.</w:t>
       </w:r>
     </w:p>
     <w:p>
@@ -10981,13 +10157,7 @@
         <w:rPr>
           <w:rFonts w:ascii="Times New Roman" w:hAnsi="Times New Roman" w:cs="Times New Roman"/>
         </w:rPr>
-        <w:t xml:space="preserve">. Boston, MA, 10–12 </w:t>
-      </w:r>
-      <w:r>
-        <w:rPr>
-          <w:rFonts w:ascii="Times New Roman" w:hAnsi="Times New Roman" w:cs="Times New Roman"/>
-        </w:rPr>
-        <w:t>August. Berkeley, CA: USENIX Association, pp. 2783–2800.</w:t>
+        <w:t>. Boston, MA, 10–12 August. Berkeley, CA: USENIX Association, pp. 2783–2800.</w:t>
       </w:r>
     </w:p>
     <w:p>
@@ -11028,13 +10198,7 @@
         <w:rPr>
           <w:rFonts w:ascii="Times New Roman" w:hAnsi="Times New Roman" w:cs="Times New Roman"/>
         </w:rPr>
-        <w:t>Albanbay</w:t>
-      </w:r>
-      <w:r>
-        <w:rPr>
-          <w:rFonts w:ascii="Times New Roman" w:hAnsi="Times New Roman" w:cs="Times New Roman"/>
-        </w:rPr>
-        <w:t xml:space="preserve">, N., Tursynbek, Y., Graffi, K., Uskenbayeva, R., Kalpeyeva, Z., Abilkaiyr, Z. and Ayapov, Y. (2025) 'Federated learning-based intrusion detection in IoT networks: performance evaluation and data scaling study', </w:t>
+        <w:t xml:space="preserve">Albanbay, N., Tursynbek, Y., Graffi, K., Uskenbayeva, R., Kalpeyeva, Z., Abilkaiyr, Z. and Ayapov, Y. (2025) 'Federated learning-based intrusion detection in IoT networks: performance evaluation and data scaling study', </w:t>
       </w:r>
       <w:r>
         <w:rPr>
@@ -11047,13 +10211,7 @@
         <w:rPr>
           <w:rFonts w:ascii="Times New Roman" w:hAnsi="Times New Roman" w:cs="Times New Roman"/>
         </w:rPr>
-        <w:t>, 14(</w:t>
-      </w:r>
-      <w:r>
-        <w:rPr>
-          <w:rFonts w:ascii="Times New Roman" w:hAnsi="Times New Roman" w:cs="Times New Roman"/>
-        </w:rPr>
-        <w:t>4), p. 78. doi: 10.3390/jsan14040078.</w:t>
+        <w:t>, 14(4), p. 78. doi: 10.3390/jsan14040078.</w:t>
       </w:r>
     </w:p>
     <w:p>
@@ -11067,13 +10225,7 @@
         <w:rPr>
           <w:rFonts w:ascii="Times New Roman" w:hAnsi="Times New Roman" w:cs="Times New Roman"/>
         </w:rPr>
-        <w:t>Antonakakis, M., April, T., Bailey, M., Bernhard, M., Bursztein, E., Cochran, J., Durumeric, Z., Halderman, J.A., Invernizzi, L., Kallitsis, M., Kumar, D., Lever, C., Ma, Z., Mason, J., Menscher, D., Seaman, C., Sulliv</w:t>
-      </w:r>
-      <w:r>
-        <w:rPr>
-          <w:rFonts w:ascii="Times New Roman" w:hAnsi="Times New Roman" w:cs="Times New Roman"/>
-        </w:rPr>
-        <w:t xml:space="preserve">an, N., Thomas, K. and Zhou, Y. (2017) 'Understanding the Mirai botnet', in </w:t>
+        <w:t xml:space="preserve">Antonakakis, M., April, T., Bailey, M., Bernhard, M., Bursztein, E., Cochran, J., Durumeric, Z., Halderman, J.A., Invernizzi, L., Kallitsis, M., Kumar, D., Lever, C., Ma, Z., Mason, J., Menscher, D., Seaman, C., Sullivan, N., Thomas, K. and Zhou, Y. (2017) 'Understanding the Mirai botnet', in </w:t>
       </w:r>
       <w:r>
         <w:rPr>
@@ -11100,13 +10252,7 @@
         <w:rPr>
           <w:rFonts w:ascii="Times New Roman" w:hAnsi="Times New Roman" w:cs="Times New Roman"/>
         </w:rPr>
-        <w:t>Basak, M., Kim, D.-W., Han, M.-M. and Shin, G.-Y. (</w:t>
-      </w:r>
-      <w:r>
-        <w:rPr>
-          <w:rFonts w:ascii="Times New Roman" w:hAnsi="Times New Roman" w:cs="Times New Roman"/>
-        </w:rPr>
-        <w:t xml:space="preserve">2025) 'X-GANet: an explainable graph-based framework for robust network intrusion detection', </w:t>
+        <w:t xml:space="preserve">Basak, M., Kim, D.-W., Han, M.-M. and Shin, G.-Y. (2025) 'X-GANet: an explainable graph-based framework for robust network intrusion detection', </w:t>
       </w:r>
       <w:r>
         <w:rPr>
@@ -11133,13 +10279,7 @@
         <w:rPr>
           <w:rFonts w:ascii="Times New Roman" w:hAnsi="Times New Roman" w:cs="Times New Roman"/>
         </w:rPr>
-        <w:t xml:space="preserve">Bera, S., Misra, S. and Vasilakos, A.V. (2017) 'Software-defined networking for Internet of Things: a </w:t>
-      </w:r>
-      <w:r>
-        <w:rPr>
-          <w:rFonts w:ascii="Times New Roman" w:hAnsi="Times New Roman" w:cs="Times New Roman"/>
-        </w:rPr>
-        <w:t xml:space="preserve">survey', </w:t>
+        <w:t xml:space="preserve">Bera, S., Misra, S. and Vasilakos, A.V. (2017) 'Software-defined networking for Internet of Things: a survey', </w:t>
       </w:r>
       <w:r>
         <w:rPr>
@@ -11173,14 +10313,7 @@
           <w:rFonts w:ascii="Times New Roman" w:hAnsi="Times New Roman" w:cs="Times New Roman"/>
           <w:i/>
         </w:rPr>
-        <w:t>arXiv</w:t>
-      </w:r>
-      <w:r>
-        <w:rPr>
-          <w:rFonts w:ascii="Times New Roman" w:hAnsi="Times New Roman" w:cs="Times New Roman"/>
-          <w:i/>
-        </w:rPr>
-        <w:t xml:space="preserve"> preprint</w:t>
+        <w:t>arXiv preprint</w:t>
       </w:r>
       <w:r>
         <w:rPr>
@@ -11214,13 +10347,7 @@
         <w:rPr>
           <w:rFonts w:ascii="Times New Roman" w:hAnsi="Times New Roman" w:cs="Times New Roman"/>
         </w:rPr>
-        <w:t>, 258, p. 110030. doi: 10.1016/j.k</w:t>
-      </w:r>
-      <w:r>
-        <w:rPr>
-          <w:rFonts w:ascii="Times New Roman" w:hAnsi="Times New Roman" w:cs="Times New Roman"/>
-        </w:rPr>
-        <w:t>nosys.2022.110030.</w:t>
+        <w:t>, 258, p. 110030. doi: 10.1016/j.knosys.2022.110030.</w:t>
       </w:r>
     </w:p>
     <w:p>
@@ -11261,13 +10388,7 @@
         <w:rPr>
           <w:rFonts w:ascii="Times New Roman" w:hAnsi="Times New Roman" w:cs="Times New Roman"/>
         </w:rPr>
-        <w:t>Han, Z., Zhang, C., Yang, G., Yang, P., Ren, J. and Liu,</w:t>
-      </w:r>
-      <w:r>
-        <w:rPr>
-          <w:rFonts w:ascii="Times New Roman" w:hAnsi="Times New Roman" w:cs="Times New Roman"/>
-        </w:rPr>
-        <w:t xml:space="preserve"> L. (2025) 'DIMK-GCN: a dynamic interactive multi-channel graph convolutional network model for intrusion detection', </w:t>
+        <w:t xml:space="preserve">Han, Z., Zhang, C., Yang, G., Yang, P., Ren, J. and Liu, L. (2025) 'DIMK-GCN: a dynamic interactive multi-channel graph convolutional network model for intrusion detection', </w:t>
       </w:r>
       <w:r>
         <w:rPr>
@@ -11294,13 +10415,7 @@
         <w:rPr>
           <w:rFonts w:ascii="Times New Roman" w:hAnsi="Times New Roman" w:cs="Times New Roman"/>
         </w:rPr>
-        <w:t>Kairouz, P., McMahan, H.B., Avent, B., Bellet, A., Bennis, M., Bhagoji, A.N</w:t>
-      </w:r>
-      <w:r>
-        <w:rPr>
-          <w:rFonts w:ascii="Times New Roman" w:hAnsi="Times New Roman" w:cs="Times New Roman"/>
-        </w:rPr>
-        <w:t xml:space="preserve">., Bonawitz, K., Charles, Z., Cormode, G., Cummings, R. et al. (2021) 'Advances and open problems in federated learning', </w:t>
+        <w:t xml:space="preserve">Kairouz, P., McMahan, H.B., Avent, B., Bellet, A., Bennis, M., Bhagoji, A.N., Bonawitz, K., Charles, Z., Cormode, G., Cummings, R. et al. (2021) 'Advances and open problems in federated learning', </w:t>
       </w:r>
       <w:r>
         <w:rPr>
@@ -11327,13 +10442,7 @@
         <w:rPr>
           <w:rFonts w:ascii="Times New Roman" w:hAnsi="Times New Roman" w:cs="Times New Roman"/>
         </w:rPr>
-        <w:t>Kokhlikyan, N., Miglani, V., Martin, M., Wang</w:t>
-      </w:r>
-      <w:r>
-        <w:rPr>
-          <w:rFonts w:ascii="Times New Roman" w:hAnsi="Times New Roman" w:cs="Times New Roman"/>
-        </w:rPr>
-        <w:t xml:space="preserve">, E., Alsallakh, B., Reynolds, J., Melnikov, A., Kliushkina, N., Araya, C., Yan, S. and Reblitz-Richardson, O. (2020) 'Captum: a unified and generic model interpretability library for PyTorch', </w:t>
+        <w:t xml:space="preserve">Kokhlikyan, N., Miglani, V., Martin, M., Wang, E., Alsallakh, B., Reynolds, J., Melnikov, A., Kliushkina, N., Araya, C., Yan, S. and Reblitz-Richardson, O. (2020) 'Captum: a unified and generic model interpretability library for PyTorch', </w:t>
       </w:r>
       <w:r>
         <w:rPr>
@@ -11360,13 +10469,7 @@
         <w:rPr>
           <w:rFonts w:ascii="Times New Roman" w:hAnsi="Times New Roman" w:cs="Times New Roman"/>
         </w:rPr>
-        <w:t>Kolias, C., Ka</w:t>
-      </w:r>
-      <w:r>
-        <w:rPr>
-          <w:rFonts w:ascii="Times New Roman" w:hAnsi="Times New Roman" w:cs="Times New Roman"/>
-        </w:rPr>
-        <w:t xml:space="preserve">mbourakis, G., Stavrou, A. and Voas, J. (2017) 'DDoS in the IoT: Mirai and other botnets', </w:t>
+        <w:t xml:space="preserve">Kolias, C., Kambourakis, G., Stavrou, A. and Voas, J. (2017) 'DDoS in the IoT: Mirai and other botnets', </w:t>
       </w:r>
       <w:r>
         <w:rPr>
@@ -11406,13 +10509,7 @@
         <w:rPr>
           <w:rFonts w:ascii="Times New Roman" w:hAnsi="Times New Roman" w:cs="Times New Roman"/>
         </w:rPr>
-        <w:t>, 4(3</w:t>
-      </w:r>
-      <w:r>
-        <w:rPr>
-          <w:rFonts w:ascii="Times New Roman" w:hAnsi="Times New Roman" w:cs="Times New Roman"/>
-        </w:rPr>
-        <w:t>), pp. 509–530. doi: 10.3390/ai4030028.</w:t>
+        <w:t>, 4(3), pp. 509–530. doi: 10.3390/ai4030028.</w:t>
       </w:r>
     </w:p>
     <w:p>
@@ -11453,13 +10550,7 @@
         <w:rPr>
           <w:rFonts w:ascii="Times New Roman" w:hAnsi="Times New Roman" w:cs="Times New Roman"/>
         </w:rPr>
-        <w:t>McMahan, B., Moore, E., Ramag</w:t>
-      </w:r>
-      <w:r>
-        <w:rPr>
-          <w:rFonts w:ascii="Times New Roman" w:hAnsi="Times New Roman" w:cs="Times New Roman"/>
-        </w:rPr>
-        <w:t xml:space="preserve">e, D., Hampson, S. and Arcas, B.A. (2017) 'Communication-efficient learning of deep networks from decentralized data', in </w:t>
+        <w:t xml:space="preserve">McMahan, B., Moore, E., Ramage, D., Hampson, S. and Arcas, B.A. (2017) 'Communication-efficient learning of deep networks from decentralized data', in </w:t>
       </w:r>
       <w:r>
         <w:rPr>
@@ -11472,13 +10563,7 @@
         <w:rPr>
           <w:rFonts w:ascii="Times New Roman" w:hAnsi="Times New Roman" w:cs="Times New Roman"/>
         </w:rPr>
-        <w:t xml:space="preserve">. Fort Lauderdale, FL, 20–22 </w:t>
-      </w:r>
-      <w:r>
-        <w:rPr>
-          <w:rFonts w:ascii="Times New Roman" w:hAnsi="Times New Roman" w:cs="Times New Roman"/>
-        </w:rPr>
-        <w:t>April. PMLR, pp. 1273–1282.</w:t>
+        <w:t>. Fort Lauderdale, FL, 20–22 April. PMLR, pp. 1273–1282.</w:t>
       </w:r>
     </w:p>
     <w:p>
@@ -11520,13 +10605,7 @@
           <w:rFonts w:ascii="Times New Roman" w:hAnsi="Times New Roman" w:cs="Times New Roman"/>
         </w:rPr>
         <w:lastRenderedPageBreak/>
-        <w:t>Pinto Neto, E.</w:t>
-      </w:r>
-      <w:r>
-        <w:rPr>
-          <w:rFonts w:ascii="Times New Roman" w:hAnsi="Times New Roman" w:cs="Times New Roman"/>
-        </w:rPr>
-        <w:t xml:space="preserve">C., Dadkhah, S., Ferreira, R., Zohourian, A., Lu, R. and Ghorbani, A.A. (2023) 'CICIoT2023: a real-time dataset and benchmark for large-scale attacks in IoT environment', </w:t>
+        <w:t xml:space="preserve">Pinto Neto, E.C., Dadkhah, S., Ferreira, R., Zohourian, A., Lu, R. and Ghorbani, A.A. (2023) 'CICIoT2023: a real-time dataset and benchmark for large-scale attacks in IoT environment', </w:t>
       </w:r>
       <w:r>
         <w:rPr>
@@ -11580,13 +10659,7 @@
         <w:rPr>
           <w:rFonts w:ascii="Times New Roman" w:hAnsi="Times New Roman" w:cs="Times New Roman"/>
         </w:rPr>
-        <w:t>Sundararajan, M., Taly, A.</w:t>
-      </w:r>
-      <w:r>
-        <w:rPr>
-          <w:rFonts w:ascii="Times New Roman" w:hAnsi="Times New Roman" w:cs="Times New Roman"/>
-        </w:rPr>
-        <w:t xml:space="preserve"> and Yan, Q. (2017) 'Axiomatic attribution for deep networks', in </w:t>
+        <w:t xml:space="preserve">Sundararajan, M., Taly, A. and Yan, Q. (2017) 'Axiomatic attribution for deep networks', in </w:t>
       </w:r>
       <w:r>
         <w:rPr>
@@ -11613,13 +10686,7 @@
         <w:rPr>
           <w:rFonts w:ascii="Times New Roman" w:hAnsi="Times New Roman" w:cs="Times New Roman"/>
         </w:rPr>
-        <w:t>Velickovic, P., Cucurull, G., Casanova, A., Romero, A., Lio,</w:t>
-      </w:r>
-      <w:r>
-        <w:rPr>
-          <w:rFonts w:ascii="Times New Roman" w:hAnsi="Times New Roman" w:cs="Times New Roman"/>
-        </w:rPr>
-        <w:t xml:space="preserve"> P. and Bengio, Y. (2018) 'Graph attention networks', in </w:t>
+        <w:t xml:space="preserve">Velickovic, P., Cucurull, G., Casanova, A., Romero, A., Lio, P. and Bengio, Y. (2018) 'Graph attention networks', in </w:t>
       </w:r>
       <w:r>
         <w:rPr>
@@ -11646,13 +10713,7 @@
         <w:rPr>
           <w:rFonts w:ascii="Times New Roman" w:hAnsi="Times New Roman" w:cs="Times New Roman"/>
         </w:rPr>
-        <w:t>Wang, R., Zhao, J., Zhang</w:t>
-      </w:r>
-      <w:r>
-        <w:rPr>
-          <w:rFonts w:ascii="Times New Roman" w:hAnsi="Times New Roman" w:cs="Times New Roman"/>
-        </w:rPr>
-        <w:t xml:space="preserve">, H., He, L., Li, H. and Huang, M. (2025) 'Network traffic analysis based on graph neural networks: a scoping review', </w:t>
+        <w:t xml:space="preserve">Wang, R., Zhao, J., Zhang, H., He, L., Li, H. and Huang, M. (2025) 'Network traffic analysis based on graph neural networks: a scoping review', </w:t>
       </w:r>
       <w:r>
         <w:rPr>
@@ -11679,13 +10740,7 @@
         <w:rPr>
           <w:rFonts w:ascii="Times New Roman" w:hAnsi="Times New Roman" w:cs="Times New Roman"/>
         </w:rPr>
-        <w:t>Yang, S., Pan, W., Li, M., Yin, M., Ren, H., Chang, Y., Liu, Y</w:t>
-      </w:r>
-      <w:r>
-        <w:rPr>
-          <w:rFonts w:ascii="Times New Roman" w:hAnsi="Times New Roman" w:cs="Times New Roman"/>
-        </w:rPr>
-        <w:t xml:space="preserve">., Zhang, S. and Lou, F. (2025) 'Industrial Internet of Things intrusion detection system based on graph neural network', </w:t>
+        <w:t xml:space="preserve">Yang, S., Pan, W., Li, M., Yin, M., Ren, H., Chang, Y., Liu, Y., Zhang, S. and Lou, F. (2025) 'Industrial Internet of Things intrusion detection system based on graph neural network', </w:t>
       </w:r>
       <w:r>
         <w:rPr>
@@ -11712,13 +10767,7 @@
         <w:rPr>
           <w:rFonts w:ascii="Times New Roman" w:hAnsi="Times New Roman" w:cs="Times New Roman"/>
         </w:rPr>
-        <w:t>Zhong, M., Lin, M., Zhang, C. and Xu, Z. (2024) 'A survey on graph neural netw</w:t>
-      </w:r>
-      <w:r>
-        <w:rPr>
-          <w:rFonts w:ascii="Times New Roman" w:hAnsi="Times New Roman" w:cs="Times New Roman"/>
-        </w:rPr>
-        <w:t xml:space="preserve">orks for intrusion detection systems: methods, trends and challenges', </w:t>
+        <w:t xml:space="preserve">Zhong, M., Lin, M., Zhang, C. and Xu, Z. (2024) 'A survey on graph neural networks for intrusion detection systems: methods, trends and challenges', </w:t>
       </w:r>
       <w:r>
         <w:rPr>
@@ -11814,7 +10863,7 @@
             <w:bCs/>
             <w:noProof/>
           </w:rPr>
-          <w:t>13</w:t>
+          <w:t>12</w:t>
         </w:r>
         <w:r>
           <w:rPr>
@@ -23862,7 +22911,7 @@
 </file>
 
 <file path=customXml/itemProps1.xml><?xml version="1.0" encoding="utf-8"?>
-<ds:datastoreItem xmlns:ds="http://schemas.openxmlformats.org/officeDocument/2006/customXml" ds:itemID="{663C9E47-B1E8-4104-93B8-7393AD4BEE00}">
+<ds:datastoreItem xmlns:ds="http://schemas.openxmlformats.org/officeDocument/2006/customXml" ds:itemID="{B442CA84-A6F5-4690-8813-613519368D3D}">
   <ds:schemaRefs>
     <ds:schemaRef ds:uri="http://schemas.openxmlformats.org/officeDocument/2006/bibliography"/>
   </ds:schemaRefs>

</xml_diff>